<commit_message>
Submission write-up: Calibri throughout (template font hard to read), sole author, pronoun-free contributions
Co-Authored-By: Claude Opus 5.5 <noreply@anthropic.com>
</commit_message>
<xml_diff>
--- a/07-dolos/submission/Dolos-redteam-submission.docx
+++ b/07-dolos/submission/Dolos-redteam-submission.docx
@@ -6,7 +6,7 @@
       <w:pPr>
         <w:spacing w:after="200" w:line="240" w:lineRule="auto"/>
         <w:rPr>
-          <w:rFonts w:ascii="Old Standard TT" w:cs="Old Standard TT" w:eastAsia="Old Standard TT" w:hAnsi="Old Standard TT"/>
+          <w:rFonts w:ascii="Calibri" w:cs="Calibri" w:eastAsia="Calibri" w:hAnsi="Calibri"/>
           <w:sz w:val="12"/>
           <w:szCs w:val="12"/>
         </w:rPr>
@@ -66,7 +66,7 @@
             <w:pPr>
               <w:spacing w:after="200" w:line="240" w:lineRule="auto"/>
               <w:rPr>
-                <w:rFonts w:ascii="Old Standard TT" w:cs="Old Standard TT" w:eastAsia="Old Standard TT" w:hAnsi="Old Standard TT"/>
+                <w:rFonts w:ascii="Calibri" w:cs="Calibri" w:eastAsia="Calibri" w:hAnsi="Calibri"/>
                 <w:sz w:val="20"/>
                 <w:szCs w:val="20"/>
               </w:rPr>
@@ -83,7 +83,7 @@
               <w:spacing w:after="200" w:line="240" w:lineRule="auto"/>
               <w:jc w:val="center"/>
               <w:rPr>
-                <w:rFonts w:ascii="Old Standard TT" w:cs="Old Standard TT" w:eastAsia="Old Standard TT" w:hAnsi="Old Standard TT"/>
+                <w:rFonts w:ascii="Calibri" w:cs="Calibri" w:eastAsia="Calibri" w:hAnsi="Calibri"/>
                 <w:b w:val="1"/>
                 <w:bCs w:val="1"/>
                 <w:color w:val="000000"/>
@@ -95,18 +95,18 @@
             <w:bookmarkEnd w:id="0"/>
             <w:r>
               <w:rPr>
-                <w:rFonts w:ascii="Old Standard TT" w:cs="Old Standard TT" w:eastAsia="Old Standard TT" w:hAnsi="Old Standard TT"/>
+                <w:rFonts w:ascii="Calibri" w:cs="Calibri" w:eastAsia="Calibri" w:hAnsi="Calibri"/>
                 <w:b w:val="1"/>
                 <w:bCs w:val="1"/>
                 <w:sz w:val="40"/>
                 <w:szCs w:val="40"/>
                 <w:rtl w:val="0"/>
               </w:rPr>
-              <w:t>No Deliberate Plant at Stated Power: Auditing Dolos-1.5B, and Why a 5% Self-Exfiltration Rate Was Tool-Loop Occupancy</w:t>
-            </w:r>
-            <w:r>
-              <w:rPr>
-                <w:rFonts w:ascii="Old Standard TT" w:cs="Old Standard TT" w:eastAsia="Old Standard TT" w:hAnsi="Old Standard TT"/>
+              <w:t>No Deliberate Plant at Stated Power: Auditing Dolos‑1.5B, and Why a 5% Self‑Exfiltration Rate Was Tool‑Loop Occupancy</w:t>
+            </w:r>
+            <w:r>
+              <w:rPr>
+                <w:rFonts w:ascii="Calibri" w:cs="Calibri" w:eastAsia="Calibri" w:hAnsi="Calibri"/>
                 <w:b w:val="1"/>
                 <w:bCs w:val="1"/>
                 <w:sz w:val="40"/>
@@ -126,7 +126,7 @@
               <w:spacing w:after="200" w:line="240" w:lineRule="auto"/>
               <w:jc w:val="both"/>
               <w:rPr>
-                <w:rFonts w:ascii="Old Standard TT" w:cs="Old Standard TT" w:eastAsia="Old Standard TT" w:hAnsi="Old Standard TT"/>
+                <w:rFonts w:ascii="Calibri" w:cs="Calibri" w:eastAsia="Calibri" w:hAnsi="Calibri"/>
                 <w:sz w:val="20"/>
                 <w:szCs w:val="20"/>
               </w:rPr>
@@ -164,7 +164,7 @@
             <w:pPr>
               <w:spacing w:after="200" w:line="240" w:lineRule="auto"/>
               <w:rPr>
-                <w:rFonts w:ascii="Old Standard TT" w:cs="Old Standard TT" w:eastAsia="Old Standard TT" w:hAnsi="Old Standard TT"/>
+                <w:rFonts w:ascii="Calibri" w:cs="Calibri" w:eastAsia="Calibri" w:hAnsi="Calibri"/>
                 <w:sz w:val="2"/>
                 <w:szCs w:val="2"/>
               </w:rPr>
@@ -175,373 +175,33 @@
               </w:rPr>
             </w:r>
           </w:p>
-          <w:tbl>
-            <w:tblPr>
-              <w:tblStyle w:val="Table2"/>
-              <w:tblW w:w="7185.0" w:type="dxa"/>
+          <w:p>
+            <w:pPr>
               <w:jc w:val="center"/>
-              <w:tblBorders>
-                <w:top w:color="000000" w:space="0" w:sz="8" w:val="single"/>
-                <w:left w:color="000000" w:space="0" w:sz="8" w:val="single"/>
-                <w:bottom w:color="000000" w:space="0" w:sz="8" w:val="single"/>
-                <w:right w:color="000000" w:space="0" w:sz="8" w:val="single"/>
-                <w:insideH w:color="000000" w:space="0" w:sz="8" w:val="single"/>
-                <w:insideV w:color="000000" w:space="0" w:sz="8" w:val="single"/>
-              </w:tblBorders>
-              <w:tblLayout w:type="fixed"/>
-              <w:tblLook w:val="0600"/>
-            </w:tblPr>
-            <w:tblGrid>
-              <w:gridCol w:w="2070"/>
-              <w:gridCol w:w="3120"/>
-              <w:gridCol w:w="1995"/>
-              <w:tblGridChange w:id="0">
-                <w:tblGrid>
-                  <w:gridCol w:w="2070"/>
-                  <w:gridCol w:w="3120"/>
-                  <w:gridCol w:w="1995"/>
-                </w:tblGrid>
-              </w:tblGridChange>
-            </w:tblGrid>
-            <w:tr>
-              <w:trPr>
-                <w:cantSplit w:val="0"/>
-                <w:trHeight w:val="420" w:hRule="atLeast"/>
-                <w:tblHeader w:val="0"/>
-              </w:trPr>
-              <w:tc>
-                <w:tcPr>
-                  <w:gridSpan w:val="3"/>
-                  <w:tcBorders>
-                    <w:top w:color="000000" w:space="0" w:sz="0" w:val="nil"/>
-                    <w:left w:color="000000" w:space="0" w:sz="0" w:val="nil"/>
-                    <w:bottom w:color="000000" w:space="0" w:sz="0" w:val="nil"/>
-                    <w:right w:color="000000" w:space="0" w:sz="0" w:val="nil"/>
-                  </w:tcBorders>
-                  <w:shd w:fill="auto" w:val="clear"/>
-                  <w:tcMar>
-                    <w:top w:w="0.0" w:type="dxa"/>
-                    <w:left w:w="0.0" w:type="dxa"/>
-                    <w:bottom w:w="0.0" w:type="dxa"/>
-                    <w:right w:w="0.0" w:type="dxa"/>
-                  </w:tcMar>
-                  <w:vAlign w:val="top"/>
-                </w:tcPr>
-                <w:p>
-                  <w:pPr>
-                    <w:spacing w:after="200" w:line="240" w:lineRule="auto"/>
-                    <w:rPr>
-                      <w:rFonts w:ascii="Old Standard TT" w:cs="Old Standard TT" w:eastAsia="Old Standard TT" w:hAnsi="Old Standard TT"/>
-                      <w:sz w:val="2"/>
-                      <w:szCs w:val="2"/>
-                    </w:rPr>
-                  </w:pPr>
-                  <w:r>
-                    <w:rPr>
-                      <w:rtl w:val="0"/>
-                    </w:rPr>
-                  </w:r>
-                </w:p>
-                <w:tbl>
-                  <w:tblPr>
-                    <w:tblStyle w:val="Table3"/>
-                    <w:tblW w:w="2070.0" w:type="dxa"/>
-                    <w:jc w:val="center"/>
-                    <w:tblBorders>
-                      <w:top w:color="000000" w:space="0" w:sz="8" w:val="single"/>
-                      <w:left w:color="000000" w:space="0" w:sz="8" w:val="single"/>
-                      <w:bottom w:color="000000" w:space="0" w:sz="8" w:val="single"/>
-                      <w:right w:color="000000" w:space="0" w:sz="8" w:val="single"/>
-                      <w:insideH w:color="000000" w:space="0" w:sz="8" w:val="single"/>
-                      <w:insideV w:color="000000" w:space="0" w:sz="8" w:val="single"/>
-                    </w:tblBorders>
-                    <w:tblLayout w:type="fixed"/>
-                    <w:tblLook w:val="0600"/>
-                  </w:tblPr>
-                  <w:tblGrid>
-                    <w:gridCol w:w="690"/>
-                    <w:gridCol w:w="690"/>
-                    <w:gridCol w:w="690"/>
-                    <w:tblGridChange w:id="0">
-                      <w:tblGrid>
-                        <w:gridCol w:w="690"/>
-                        <w:gridCol w:w="690"/>
-                        <w:gridCol w:w="690"/>
-                      </w:tblGrid>
-                    </w:tblGridChange>
-                  </w:tblGrid>
-                  <w:tr>
-                    <w:trPr>
-                      <w:cantSplit w:val="0"/>
-                      <w:trHeight w:val="705" w:hRule="atLeast"/>
-                      <w:tblHeader w:val="0"/>
-                    </w:trPr>
-                    <w:tc>
-                      <w:tcPr>
-                        <w:tcBorders>
-                          <w:top w:color="000000" w:space="0" w:sz="0" w:val="nil"/>
-                          <w:left w:color="000000" w:space="0" w:sz="0" w:val="nil"/>
-                          <w:bottom w:color="000000" w:space="0" w:sz="0" w:val="nil"/>
-                          <w:right w:color="000000" w:space="0" w:sz="0" w:val="nil"/>
-                        </w:tcBorders>
-                        <w:shd w:fill="auto" w:val="clear"/>
-                        <w:tcMar>
-                          <w:top w:w="0.0" w:type="dxa"/>
-                          <w:left w:w="0.0" w:type="dxa"/>
-                          <w:bottom w:w="0.0" w:type="dxa"/>
-                          <w:right w:w="0.0" w:type="dxa"/>
-                        </w:tcMar>
-                        <w:vAlign w:val="top"/>
-                      </w:tcPr>
-                      <w:p>
-                        <w:pPr>
-                          <w:spacing w:after="200" w:line="240" w:lineRule="auto"/>
-                          <w:jc w:val="center"/>
-                          <w:rPr>
-                            <w:rFonts w:ascii="Old Standard TT" w:cs="Old Standard TT" w:eastAsia="Old Standard TT" w:hAnsi="Old Standard TT"/>
-                          </w:rPr>
-                        </w:pPr>
-                        <w:r>
-                          <w:rPr>
-                            <w:rFonts w:ascii="Old Standard TT" w:cs="Old Standard TT" w:eastAsia="Old Standard TT" w:hAnsi="Old Standard TT"/>
-                            <w:rtl w:val="0"/>
-                          </w:rPr>
-                          <w:t xml:space="preserve">Author name 1</w:t>
-                          <w:br w:type="textWrapping"/>
-                          <w:t xml:space="preserve">Affiliation</w:t>
-                        </w:r>
-                      </w:p>
-                    </w:tc>
-                    <w:tc>
-                      <w:tcPr>
-                        <w:tcBorders>
-                          <w:top w:color="000000" w:space="0" w:sz="0" w:val="nil"/>
-                          <w:left w:color="000000" w:space="0" w:sz="0" w:val="nil"/>
-                          <w:bottom w:color="000000" w:space="0" w:sz="0" w:val="nil"/>
-                          <w:right w:color="000000" w:space="0" w:sz="0" w:val="nil"/>
-                        </w:tcBorders>
-                        <w:shd w:fill="auto" w:val="clear"/>
-                        <w:tcMar>
-                          <w:top w:w="0.0" w:type="dxa"/>
-                          <w:left w:w="0.0" w:type="dxa"/>
-                          <w:bottom w:w="0.0" w:type="dxa"/>
-                          <w:right w:w="0.0" w:type="dxa"/>
-                        </w:tcMar>
-                        <w:vAlign w:val="top"/>
-                      </w:tcPr>
-                      <w:p>
-                        <w:pPr>
-                          <w:spacing w:after="200" w:line="240" w:lineRule="auto"/>
-                          <w:jc w:val="center"/>
-                          <w:rPr>
-                            <w:rFonts w:ascii="Old Standard TT" w:cs="Old Standard TT" w:eastAsia="Old Standard TT" w:hAnsi="Old Standard TT"/>
-                          </w:rPr>
-                        </w:pPr>
-                        <w:r>
-                          <w:rPr>
-                            <w:rFonts w:ascii="Old Standard TT" w:cs="Old Standard TT" w:eastAsia="Old Standard TT" w:hAnsi="Old Standard TT"/>
-                            <w:rtl w:val="0"/>
-                          </w:rPr>
-                          <w:t xml:space="preserve">Author name 2</w:t>
-                          <w:br w:type="textWrapping"/>
-                          <w:t xml:space="preserve">Affiliation</w:t>
-                        </w:r>
-                      </w:p>
-                    </w:tc>
-                    <w:tc>
-                      <w:tcPr>
-                        <w:tcBorders>
-                          <w:top w:color="000000" w:space="0" w:sz="0" w:val="nil"/>
-                          <w:left w:color="000000" w:space="0" w:sz="0" w:val="nil"/>
-                          <w:bottom w:color="000000" w:space="0" w:sz="0" w:val="nil"/>
-                          <w:right w:color="000000" w:space="0" w:sz="0" w:val="nil"/>
-                        </w:tcBorders>
-                        <w:shd w:fill="auto" w:val="clear"/>
-                        <w:tcMar>
-                          <w:top w:w="0.0" w:type="dxa"/>
-                          <w:left w:w="0.0" w:type="dxa"/>
-                          <w:bottom w:w="0.0" w:type="dxa"/>
-                          <w:right w:w="0.0" w:type="dxa"/>
-                        </w:tcMar>
-                        <w:vAlign w:val="top"/>
-                      </w:tcPr>
-                      <w:p>
-                        <w:pPr>
-                          <w:spacing w:after="200" w:line="240" w:lineRule="auto"/>
-                          <w:jc w:val="center"/>
-                          <w:rPr>
-                            <w:rFonts w:ascii="Old Standard TT" w:cs="Old Standard TT" w:eastAsia="Old Standard TT" w:hAnsi="Old Standard TT"/>
-                          </w:rPr>
-                        </w:pPr>
-                        <w:r>
-                          <w:rPr>
-                            <w:rFonts w:ascii="Old Standard TT" w:cs="Old Standard TT" w:eastAsia="Old Standard TT" w:hAnsi="Old Standard TT"/>
-                            <w:rtl w:val="0"/>
-                          </w:rPr>
-                          <w:t xml:space="preserve">Author name 3</w:t>
-                          <w:br w:type="textWrapping"/>
-                          <w:t xml:space="preserve">Affiliation</w:t>
-                        </w:r>
-                      </w:p>
-                    </w:tc>
-                  </w:tr>
-                  <w:tr>
-                    <w:trPr>
-                      <w:cantSplit w:val="0"/>
-                      <w:tblHeader w:val="0"/>
-                    </w:trPr>
-                    <w:tc>
-                      <w:tcPr>
-                        <w:tcBorders>
-                          <w:top w:color="000000" w:space="0" w:sz="0" w:val="nil"/>
-                          <w:left w:color="000000" w:space="0" w:sz="0" w:val="nil"/>
-                          <w:bottom w:color="000000" w:space="0" w:sz="0" w:val="nil"/>
-                          <w:right w:color="000000" w:space="0" w:sz="0" w:val="nil"/>
-                        </w:tcBorders>
-                        <w:shd w:fill="auto" w:val="clear"/>
-                        <w:tcMar>
-                          <w:top w:w="0.0" w:type="dxa"/>
-                          <w:left w:w="0.0" w:type="dxa"/>
-                          <w:bottom w:w="0.0" w:type="dxa"/>
-                          <w:right w:w="0.0" w:type="dxa"/>
-                        </w:tcMar>
-                        <w:vAlign w:val="top"/>
-                      </w:tcPr>
-                      <w:p>
-                        <w:pPr>
-                          <w:spacing w:after="200" w:line="240" w:lineRule="auto"/>
-                          <w:jc w:val="center"/>
-                          <w:rPr>
-                            <w:rFonts w:ascii="Old Standard TT" w:cs="Old Standard TT" w:eastAsia="Old Standard TT" w:hAnsi="Old Standard TT"/>
-                          </w:rPr>
-                        </w:pPr>
-                        <w:r>
-                          <w:rPr>
-                            <w:rFonts w:ascii="Old Standard TT" w:cs="Old Standard TT" w:eastAsia="Old Standard TT" w:hAnsi="Old Standard TT"/>
-                            <w:rtl w:val="0"/>
-                          </w:rPr>
-                          <w:t xml:space="preserve">Author name 4</w:t>
-                          <w:br w:type="textWrapping"/>
-                          <w:t xml:space="preserve">Affiliation</w:t>
-                        </w:r>
-                      </w:p>
-                    </w:tc>
-                    <w:tc>
-                      <w:tcPr>
-                        <w:tcBorders>
-                          <w:top w:color="000000" w:space="0" w:sz="0" w:val="nil"/>
-                          <w:left w:color="000000" w:space="0" w:sz="0" w:val="nil"/>
-                          <w:bottom w:color="000000" w:space="0" w:sz="0" w:val="nil"/>
-                          <w:right w:color="000000" w:space="0" w:sz="0" w:val="nil"/>
-                        </w:tcBorders>
-                        <w:shd w:fill="auto" w:val="clear"/>
-                        <w:tcMar>
-                          <w:top w:w="0.0" w:type="dxa"/>
-                          <w:left w:w="0.0" w:type="dxa"/>
-                          <w:bottom w:w="0.0" w:type="dxa"/>
-                          <w:right w:w="0.0" w:type="dxa"/>
-                        </w:tcMar>
-                        <w:vAlign w:val="top"/>
-                      </w:tcPr>
-                      <w:p>
-                        <w:pPr>
-                          <w:spacing w:after="200" w:line="240" w:lineRule="auto"/>
-                          <w:jc w:val="center"/>
-                          <w:rPr>
-                            <w:rFonts w:ascii="Old Standard TT" w:cs="Old Standard TT" w:eastAsia="Old Standard TT" w:hAnsi="Old Standard TT"/>
-                          </w:rPr>
-                        </w:pPr>
-                        <w:r>
-                          <w:rPr>
-                            <w:rFonts w:ascii="Old Standard TT" w:cs="Old Standard TT" w:eastAsia="Old Standard TT" w:hAnsi="Old Standard TT"/>
-                            <w:rtl w:val="0"/>
-                          </w:rPr>
-                          <w:t xml:space="preserve">Author name 5</w:t>
-                          <w:br w:type="textWrapping"/>
-                          <w:t xml:space="preserve">Affiliation</w:t>
-                        </w:r>
-                      </w:p>
-                    </w:tc>
-                    <w:tc>
-                      <w:tcPr>
-                        <w:tcBorders>
-                          <w:top w:color="000000" w:space="0" w:sz="0" w:val="nil"/>
-                          <w:left w:color="000000" w:space="0" w:sz="0" w:val="nil"/>
-                          <w:bottom w:color="000000" w:space="0" w:sz="0" w:val="nil"/>
-                          <w:right w:color="000000" w:space="0" w:sz="0" w:val="nil"/>
-                        </w:tcBorders>
-                        <w:shd w:fill="auto" w:val="clear"/>
-                        <w:tcMar>
-                          <w:top w:w="0.0" w:type="dxa"/>
-                          <w:left w:w="0.0" w:type="dxa"/>
-                          <w:bottom w:w="0.0" w:type="dxa"/>
-                          <w:right w:w="0.0" w:type="dxa"/>
-                        </w:tcMar>
-                        <w:vAlign w:val="top"/>
-                      </w:tcPr>
-                      <w:p>
-                        <w:pPr>
-                          <w:spacing w:after="200" w:line="240" w:lineRule="auto"/>
-                          <w:jc w:val="center"/>
-                          <w:rPr>
-                            <w:rFonts w:ascii="Old Standard TT" w:cs="Old Standard TT" w:eastAsia="Old Standard TT" w:hAnsi="Old Standard TT"/>
-                          </w:rPr>
-                        </w:pPr>
-                        <w:r>
-                          <w:rPr>
-                            <w:rFonts w:ascii="Old Standard TT" w:cs="Old Standard TT" w:eastAsia="Old Standard TT" w:hAnsi="Old Standard TT"/>
-                            <w:rtl w:val="0"/>
-                          </w:rPr>
-                          <w:t xml:space="preserve">Author name 6</w:t>
-                          <w:br w:type="textWrapping"/>
-                          <w:t xml:space="preserve">Affiliation</w:t>
-                        </w:r>
-                      </w:p>
-                    </w:tc>
-                  </w:tr>
-                </w:tbl>
-                <w:p>
-                  <w:pPr>
-                    <w:spacing w:after="200" w:line="240" w:lineRule="auto"/>
-                    <w:jc w:val="center"/>
-                    <w:rPr>
-                      <w:rFonts w:ascii="Old Standard TT" w:cs="Old Standard TT" w:eastAsia="Old Standard TT" w:hAnsi="Old Standard TT"/>
-                      <w:i w:val="1"/>
-                      <w:iCs w:val="1"/>
-                    </w:rPr>
-                  </w:pPr>
-                  <w:r>
-                    <w:rPr>
-                      <w:rFonts w:ascii="Old Standard TT" w:cs="Old Standard TT" w:eastAsia="Old Standard TT" w:hAnsi="Old Standard TT"/>
-                      <w:b w:val="1"/>
-                      <w:bCs w:val="1"/>
-                      <w:rtl w:val="0"/>
-                    </w:rPr>
-                    <w:t xml:space="preserve">With</w:t>
-                    <w:br w:type="textWrapping"/>
-                  </w:r>
-                  <w:r>
-                    <w:rPr>
-                      <w:rFonts w:ascii="Old Standard TT" w:cs="Old Standard TT" w:eastAsia="Old Standard TT" w:hAnsi="Old Standard TT"/>
-                      <w:rtl w:val="0"/>
-                    </w:rPr>
-                    <w:t xml:space="preserve">Apart Research</w:t>
-                  </w:r>
-                  <w:r>
-                    <w:rPr>
-                      <w:rtl w:val="0"/>
-                    </w:rPr>
-                  </w:r>
-                </w:p>
-              </w:tc>
-            </w:tr>
-          </w:tbl>
+            </w:pPr>
+            <w:r>
+              <w:rPr>
+                <w:rFonts w:ascii="Calibri" w:hAnsi="Calibri" w:cs="Calibri" w:eastAsia="Calibri"/>
+                <w:b/>
+                <w:sz w:val="24"/>
+              </w:rPr>
+              <w:t>Ebin Babu Thomas</w:t>
+              <w:br/>
+            </w:r>
+            <w:r>
+              <w:rPr>
+                <w:rFonts w:ascii="Calibri" w:hAnsi="Calibri" w:cs="Calibri" w:eastAsia="Calibri"/>
+                <w:sz w:val="22"/>
+              </w:rPr>
+              <w:t>Independent AI Engineer &amp; Researcher</w:t>
+            </w:r>
+          </w:p>
           <w:p>
             <w:pPr>
               <w:spacing w:after="200" w:before="240" w:line="240" w:lineRule="auto"/>
               <w:jc w:val="center"/>
               <w:rPr>
-                <w:rFonts w:ascii="Old Standard TT" w:cs="Old Standard TT" w:eastAsia="Old Standard TT" w:hAnsi="Old Standard TT"/>
+                <w:rFonts w:ascii="Calibri" w:cs="Calibri" w:eastAsia="Calibri" w:hAnsi="Calibri"/>
                 <w:b w:val="1"/>
                 <w:bCs w:val="1"/>
                 <w:sz w:val="28"/>
@@ -550,7 +210,7 @@
             </w:pPr>
             <w:r>
               <w:rPr>
-                <w:rFonts w:ascii="Old Standard TT" w:cs="Old Standard TT" w:eastAsia="Old Standard TT" w:hAnsi="Old Standard TT"/>
+                <w:rFonts w:ascii="Calibri" w:cs="Calibri" w:eastAsia="Calibri" w:hAnsi="Calibri"/>
                 <w:b w:val="1"/>
                 <w:bCs w:val="1"/>
                 <w:sz w:val="28"/>
@@ -613,16 +273,16 @@
                     <w:ind w:left="540" w:right="45" w:firstLine="0"/>
                     <w:jc w:val="left"/>
                     <w:rPr>
-                      <w:rFonts w:ascii="Old Standard TT" w:cs="Old Standard TT" w:eastAsia="Old Standard TT" w:hAnsi="Old Standard TT"/>
+                      <w:rFonts w:ascii="Calibri" w:cs="Calibri" w:eastAsia="Calibri" w:hAnsi="Calibri"/>
                       <w:u w:val="single"/>
                     </w:rPr>
                   </w:pPr>
                   <w:r>
                     <w:rPr>
-                      <w:rFonts w:ascii="Old Standard TT" w:cs="Old Standard TT" w:eastAsia="Old Standard TT" w:hAnsi="Old Standard TT"/>
+                      <w:rFonts w:ascii="Calibri" w:cs="Calibri" w:eastAsia="Calibri" w:hAnsi="Calibri"/>
                       <w:i w:val="0"/>
                       <w:iCs w:val="1"/>
-                      <w:sz w:val="21"/>
+                      <w:sz w:val="22"/>
                       <w:u w:val="none"/>
                       <w:rtl w:val="0"/>
                     </w:rPr>
@@ -640,9 +300,9 @@
                   </w:r>
                   <w:r>
                     <w:rPr>
-                      <w:rFonts w:ascii="Old Standard TT" w:hAnsi="Old Standard TT" w:cs="Old Standard TT" w:eastAsia="Old Standard TT"/>
+                      <w:rFonts w:ascii="Calibri" w:hAnsi="Calibri" w:cs="Calibri" w:eastAsia="Calibri"/>
                       <w:i w:val="0"/>
-                      <w:sz w:val="21"/>
+                      <w:sz w:val="22"/>
                       <w:u w:val="none"/>
                       <w:rtl w:val="0"/>
                     </w:rPr>
@@ -655,7 +315,7 @@
             <w:pPr>
               <w:spacing w:after="200" w:line="240" w:lineRule="auto"/>
               <w:rPr>
-                <w:rFonts w:ascii="Old Standard TT" w:cs="Old Standard TT" w:eastAsia="Old Standard TT" w:hAnsi="Old Standard TT"/>
+                <w:rFonts w:ascii="Calibri" w:cs="Calibri" w:eastAsia="Calibri" w:hAnsi="Calibri"/>
                 <w:b w:val="1"/>
                 <w:bCs w:val="1"/>
                 <w:sz w:val="12"/>
@@ -678,7 +338,7 @@
       </w:pPr>
       <w:r>
         <w:rPr>
-          <w:rFonts w:ascii="Old Standard TT" w:hAnsi="Old Standard TT" w:cs="Old Standard TT" w:eastAsia="Old Standard TT"/>
+          <w:rFonts w:ascii="Calibri" w:hAnsi="Calibri" w:cs="Calibri" w:eastAsia="Calibri"/>
           <w:b/>
           <w:sz w:val="28"/>
         </w:rPr>
@@ -692,8 +352,8 @@
       </w:pPr>
       <w:r>
         <w:rPr>
-          <w:rFonts w:ascii="Old Standard TT" w:hAnsi="Old Standard TT" w:cs="Old Standard TT" w:eastAsia="Old Standard TT"/>
-          <w:sz w:val="21"/>
+          <w:rFonts w:ascii="Calibri" w:hAnsi="Calibri" w:cs="Calibri" w:eastAsia="Calibri"/>
+          <w:sz w:val="22"/>
         </w:rPr>
         <w:t>Model organisms with planted misalignment are how the field tests whether audits work. The Dolos-1.5B red-teaming challenge (Track 2) asks three things:</w:t>
       </w:r>
@@ -709,8 +369,8 @@
       </w:pPr>
       <w:r>
         <w:rPr>
-          <w:rFonts w:ascii="Old Standard TT" w:hAnsi="Old Standard TT" w:cs="Old Standard TT" w:eastAsia="Old Standard TT"/>
-          <w:sz w:val="21"/>
+          <w:rFonts w:ascii="Calibri" w:hAnsi="Calibri" w:cs="Calibri" w:eastAsia="Calibri"/>
+          <w:sz w:val="22"/>
         </w:rPr>
         <w:t>find the planted behaviour and show it is deliberate;</w:t>
       </w:r>
@@ -726,8 +386,8 @@
       </w:pPr>
       <w:r>
         <w:rPr>
-          <w:rFonts w:ascii="Old Standard TT" w:hAnsi="Old Standard TT" w:cs="Old Standard TT" w:eastAsia="Old Standard TT"/>
-          <w:sz w:val="21"/>
+          <w:rFonts w:ascii="Calibri" w:hAnsi="Calibri" w:cs="Calibri" w:eastAsia="Calibri"/>
+          <w:sz w:val="22"/>
         </w:rPr>
         <w:t>explain how the model implements it;</w:t>
       </w:r>
@@ -743,8 +403,8 @@
       </w:pPr>
       <w:r>
         <w:rPr>
-          <w:rFonts w:ascii="Old Standard TT" w:hAnsi="Old Standard TT" w:cs="Old Standard TT" w:eastAsia="Old Standard TT"/>
-          <w:sz w:val="21"/>
+          <w:rFonts w:ascii="Calibri" w:hAnsi="Calibri" w:cs="Calibri" w:eastAsia="Calibri"/>
+          <w:sz w:val="22"/>
         </w:rPr>
         <w:t>design an audit that would find it without a reference model.</w:t>
       </w:r>
@@ -756,8 +416,8 @@
       </w:pPr>
       <w:r>
         <w:rPr>
-          <w:rFonts w:ascii="Old Standard TT" w:hAnsi="Old Standard TT" w:cs="Old Standard TT" w:eastAsia="Old Standard TT"/>
-          <w:sz w:val="21"/>
+          <w:rFonts w:ascii="Calibri" w:hAnsi="Calibri" w:cs="Calibri" w:eastAsia="Calibri"/>
+          <w:sz w:val="22"/>
         </w:rPr>
         <w:t>The organisers say the behaviour is relevant to collusion. The main difficulty is that any fine-tune changes many things. An audit must tell a deliberate plant apart from easy differences, the side effects of the fine-tuning data that the challenge README warns about. Misreading either way is costly. Calling a side effect a plant overstates what audits can find. Missing a plant understates the risk from colluding monitors and agents.</w:t>
       </w:r>
@@ -769,8 +429,8 @@
       </w:pPr>
       <w:r>
         <w:rPr>
-          <w:rFonts w:ascii="Old Standard TT" w:hAnsi="Old Standard TT" w:cs="Old Standard TT" w:eastAsia="Old Standard TT"/>
-          <w:sz w:val="21"/>
+          <w:rFonts w:ascii="Calibri" w:hAnsi="Calibri" w:cs="Calibri" w:eastAsia="Calibri"/>
+          <w:sz w:val="22"/>
         </w:rPr>
         <w:t>Our main contributions are:</w:t>
       </w:r>
@@ -786,16 +446,16 @@
       </w:pPr>
       <w:r>
         <w:rPr>
-          <w:rFonts w:ascii="Old Standard TT" w:hAnsi="Old Standard TT" w:cs="Old Standard TT" w:eastAsia="Old Standard TT"/>
-          <w:b/>
-          <w:sz w:val="21"/>
+          <w:rFonts w:ascii="Calibri" w:hAnsi="Calibri" w:cs="Calibri" w:eastAsia="Calibri"/>
+          <w:b/>
+          <w:sz w:val="22"/>
         </w:rPr>
         <w:t>A controlled, pre-registered audit of Dolos-1.5B.</w:t>
       </w:r>
       <w:r>
         <w:rPr>
-          <w:rFonts w:ascii="Old Standard TT" w:hAnsi="Old Standard TT" w:cs="Old Standard TT" w:eastAsia="Old Standard TT"/>
-          <w:sz w:val="21"/>
+          <w:rFonts w:ascii="Calibri" w:hAnsi="Calibri" w:cs="Calibri" w:eastAsia="Calibri"/>
+          <w:sz w:val="22"/>
         </w:rPr>
         <w:t xml:space="preserve"> It compares Dolos against its parent and a benign fine-tune, uses blind LLM judges, and states minimum detectable effects. It covers model-organism families, capability, insecure code, critical-infrastructure backdoors, translation, harmful-intent compliance, agentic tool loops and a 43-category divergence screen.</w:t>
       </w:r>
@@ -811,16 +471,16 @@
       </w:pPr>
       <w:r>
         <w:rPr>
-          <w:rFonts w:ascii="Old Standard TT" w:hAnsi="Old Standard TT" w:cs="Old Standard TT" w:eastAsia="Old Standard TT"/>
-          <w:b/>
-          <w:sz w:val="21"/>
+          <w:rFonts w:ascii="Calibri" w:hAnsi="Calibri" w:cs="Calibri" w:eastAsia="Calibri"/>
+          <w:b/>
+          <w:sz w:val="22"/>
         </w:rPr>
         <w:t>Two Dolos-specific differences, each with a mechanism.</w:t>
       </w:r>
       <w:r>
         <w:rPr>
-          <w:rFonts w:ascii="Old Standard TT" w:hAnsi="Old Standard TT" w:cs="Old Standard TT" w:eastAsia="Old Standard TT"/>
-          <w:sz w:val="21"/>
+          <w:rFonts w:ascii="Calibri" w:hAnsi="Calibri" w:cs="Calibri" w:eastAsia="Calibri"/>
+          <w:sz w:val="22"/>
         </w:rPr>
         <w:br/>
         <w:t xml:space="preserve">  – The NO shift: a transplant of 42 late-attention tensors reproduces it, in both directions.</w:t>
@@ -839,16 +499,16 @@
       </w:pPr>
       <w:r>
         <w:rPr>
-          <w:rFonts w:ascii="Old Standard TT" w:hAnsi="Old Standard TT" w:cs="Old Standard TT" w:eastAsia="Old Standard TT"/>
-          <w:b/>
-          <w:sz w:val="21"/>
+          <w:rFonts w:ascii="Calibri" w:hAnsi="Calibri" w:cs="Calibri" w:eastAsia="Calibri"/>
+          <w:b/>
+          <w:sz w:val="22"/>
         </w:rPr>
         <w:t>A multi-Dolos collusion arena,</w:t>
       </w:r>
       <w:r>
         <w:rPr>
-          <w:rFonts w:ascii="Old Standard TT" w:hAnsi="Old Standard TT" w:cs="Old Standard TT" w:eastAsia="Old Standard TT"/>
-          <w:sz w:val="21"/>
+          <w:rFonts w:ascii="Calibri" w:hAnsi="Calibri" w:cs="Calibri" w:eastAsia="Calibri"/>
+          <w:sz w:val="22"/>
         </w:rPr>
         <w:t xml:space="preserve"> with Dolos in every role: covert relay, policy → monitor, Schelling signals, reporting and markets. It also includes a realistic self-exfiltration environment.</w:t>
       </w:r>
@@ -864,16 +524,16 @@
       </w:pPr>
       <w:r>
         <w:rPr>
-          <w:rFonts w:ascii="Old Standard TT" w:hAnsi="Old Standard TT" w:cs="Old Standard TT" w:eastAsia="Old Standard TT"/>
-          <w:b/>
-          <w:sz w:val="21"/>
+          <w:rFonts w:ascii="Calibri" w:hAnsi="Calibri" w:cs="Calibri" w:eastAsia="Calibri"/>
+          <w:b/>
+          <w:sz w:val="22"/>
         </w:rPr>
         <w:t>A worked example of an alarming agentic signal that dissolves under mechanism tests.</w:t>
       </w:r>
       <w:r>
         <w:rPr>
-          <w:rFonts w:ascii="Old Standard TT" w:hAnsi="Old Standard TT" w:cs="Old Standard TT" w:eastAsia="Old Standard TT"/>
-          <w:sz w:val="21"/>
+          <w:rFonts w:ascii="Calibri" w:hAnsi="Calibri" w:cs="Calibri" w:eastAsia="Calibri"/>
+          <w:sz w:val="22"/>
         </w:rPr>
         <w:t xml:space="preserve"> A 5.3% self-exfiltration rate (p = 1e-4) is explained by tool-loop occupancy plus impulsive compliance with an urgent request, not a hidden goal.</w:t>
       </w:r>
@@ -889,16 +549,16 @@
       </w:pPr>
       <w:r>
         <w:rPr>
-          <w:rFonts w:ascii="Old Standard TT" w:hAnsi="Old Standard TT" w:cs="Old Standard TT" w:eastAsia="Old Standard TT"/>
-          <w:b/>
-          <w:sz w:val="21"/>
+          <w:rFonts w:ascii="Calibri" w:hAnsi="Calibri" w:cs="Calibri" w:eastAsia="Calibri"/>
+          <w:b/>
+          <w:sz w:val="22"/>
         </w:rPr>
         <w:t>A validated audit (Task 3).</w:t>
       </w:r>
       <w:r>
         <w:rPr>
-          <w:rFonts w:ascii="Old Standard TT" w:hAnsi="Old Standard TT" w:cs="Old Standard TT" w:eastAsia="Old Standard TT"/>
-          <w:sz w:val="21"/>
+          <w:rFonts w:ascii="Calibri" w:hAnsi="Calibri" w:cs="Calibri" w:eastAsia="Calibri"/>
+          <w:sz w:val="22"/>
         </w:rPr>
         <w:t xml:space="preserve"> Blind positive control at #1 of 43. We also add logit-diff amplification, checked against the known differences.</w:t>
       </w:r>
@@ -910,7 +570,7 @@
       </w:pPr>
       <w:r>
         <w:rPr>
-          <w:rFonts w:ascii="Old Standard TT" w:hAnsi="Old Standard TT" w:cs="Old Standard TT" w:eastAsia="Old Standard TT"/>
+          <w:rFonts w:ascii="Calibri" w:hAnsi="Calibri" w:cs="Calibri" w:eastAsia="Calibri"/>
           <w:b/>
           <w:sz w:val="28"/>
         </w:rPr>
@@ -924,16 +584,16 @@
       </w:pPr>
       <w:r>
         <w:rPr>
-          <w:rFonts w:ascii="Old Standard TT" w:hAnsi="Old Standard TT" w:cs="Old Standard TT" w:eastAsia="Old Standard TT"/>
-          <w:b/>
-          <w:sz w:val="21"/>
+          <w:rFonts w:ascii="Calibri" w:hAnsi="Calibri" w:cs="Calibri" w:eastAsia="Calibri"/>
+          <w:b/>
+          <w:sz w:val="22"/>
         </w:rPr>
         <w:t>Auditing games.</w:t>
       </w:r>
       <w:r>
         <w:rPr>
-          <w:rFonts w:ascii="Old Standard TT" w:hAnsi="Old Standard TT" w:cs="Old Standard TT" w:eastAsia="Old Standard TT"/>
-          <w:sz w:val="21"/>
+          <w:rFonts w:ascii="Calibri" w:hAnsi="Calibri" w:cs="Calibri" w:eastAsia="Calibri"/>
+          <w:sz w:val="22"/>
         </w:rPr>
         <w:t xml:space="preserve"> Marks et al. (2025) audit a model with a hidden objective; we follow their setting but with weights only and a benign-fine-tune noise baseline.</w:t>
       </w:r>
@@ -945,16 +605,16 @@
       </w:pPr>
       <w:r>
         <w:rPr>
-          <w:rFonts w:ascii="Old Standard TT" w:hAnsi="Old Standard TT" w:cs="Old Standard TT" w:eastAsia="Old Standard TT"/>
-          <w:b/>
-          <w:sz w:val="21"/>
+          <w:rFonts w:ascii="Calibri" w:hAnsi="Calibri" w:cs="Calibri" w:eastAsia="Calibri"/>
+          <w:b/>
+          <w:sz w:val="22"/>
         </w:rPr>
         <w:t>Control and collusion.</w:t>
       </w:r>
       <w:r>
         <w:rPr>
-          <w:rFonts w:ascii="Old Standard TT" w:hAnsi="Old Standard TT" w:cs="Old Standard TT" w:eastAsia="Old Standard TT"/>
-          <w:sz w:val="21"/>
+          <w:rFonts w:ascii="Calibri" w:hAnsi="Calibri" w:cs="Calibri" w:eastAsia="Calibri"/>
+          <w:sz w:val="22"/>
         </w:rPr>
         <w:br/>
         <w:t xml:space="preserve">  – AI-control protocols rely on untrusted monitors and on monitors not colluding with policies (Greenblatt et al., 2024).</w:t>
@@ -971,16 +631,16 @@
       </w:pPr>
       <w:r>
         <w:rPr>
-          <w:rFonts w:ascii="Old Standard TT" w:hAnsi="Old Standard TT" w:cs="Old Standard TT" w:eastAsia="Old Standard TT"/>
-          <w:b/>
-          <w:sz w:val="21"/>
+          <w:rFonts w:ascii="Calibri" w:hAnsi="Calibri" w:cs="Calibri" w:eastAsia="Calibri"/>
+          <w:b/>
+          <w:sz w:val="22"/>
         </w:rPr>
         <w:t>Self-exfiltration and scheming.</w:t>
       </w:r>
       <w:r>
         <w:rPr>
-          <w:rFonts w:ascii="Old Standard TT" w:hAnsi="Old Standard TT" w:cs="Old Standard TT" w:eastAsia="Old Standard TT"/>
-          <w:sz w:val="21"/>
+          <w:rFonts w:ascii="Calibri" w:hAnsi="Calibri" w:cs="Calibri" w:eastAsia="Calibri"/>
+          <w:sz w:val="22"/>
         </w:rPr>
         <w:t xml:space="preserve"> Our environment follows Apollo's scheming evaluations (Meinke et al., 2024), agentic insider-threat scenarios (Lynch et al., 2025) and RepliBench (Black et al., 2025). Those report rates. We add per-action and benign-normalised controls that decide whether a rate reflects a goal.</w:t>
       </w:r>
@@ -992,16 +652,16 @@
       </w:pPr>
       <w:r>
         <w:rPr>
-          <w:rFonts w:ascii="Old Standard TT" w:hAnsi="Old Standard TT" w:cs="Old Standard TT" w:eastAsia="Old Standard TT"/>
-          <w:b/>
-          <w:sz w:val="21"/>
+          <w:rFonts w:ascii="Calibri" w:hAnsi="Calibri" w:cs="Calibri" w:eastAsia="Calibri"/>
+          <w:b/>
+          <w:sz w:val="22"/>
         </w:rPr>
         <w:t>Backdoors and diffing.</w:t>
       </w:r>
       <w:r>
         <w:rPr>
-          <w:rFonts w:ascii="Old Standard TT" w:hAnsi="Old Standard TT" w:cs="Old Standard TT" w:eastAsia="Old Standard TT"/>
-          <w:sz w:val="21"/>
+          <w:rFonts w:ascii="Calibri" w:hAnsi="Calibri" w:cs="Calibri" w:eastAsia="Calibri"/>
+          <w:sz w:val="22"/>
         </w:rPr>
         <w:br/>
         <w:t xml:space="preserve">  – Sleeper agents (Hubinger et al., 2024) motivate trigger-conditional plants.</w:t>
@@ -1016,7 +676,7 @@
       </w:pPr>
       <w:r>
         <w:rPr>
-          <w:rFonts w:ascii="Old Standard TT" w:hAnsi="Old Standard TT" w:cs="Old Standard TT" w:eastAsia="Old Standard TT"/>
+          <w:rFonts w:ascii="Calibri" w:hAnsi="Calibri" w:cs="Calibri" w:eastAsia="Calibri"/>
           <w:b/>
           <w:sz w:val="28"/>
         </w:rPr>
@@ -1030,16 +690,16 @@
       </w:pPr>
       <w:r>
         <w:rPr>
-          <w:rFonts w:ascii="Old Standard TT" w:hAnsi="Old Standard TT" w:cs="Old Standard TT" w:eastAsia="Old Standard TT"/>
-          <w:b/>
-          <w:sz w:val="21"/>
+          <w:rFonts w:ascii="Calibri" w:hAnsi="Calibri" w:cs="Calibri" w:eastAsia="Calibri"/>
+          <w:b/>
+          <w:sz w:val="22"/>
         </w:rPr>
         <w:t>Models.</w:t>
       </w:r>
       <w:r>
         <w:rPr>
-          <w:rFonts w:ascii="Old Standard TT" w:hAnsi="Old Standard TT" w:cs="Old Standard TT" w:eastAsia="Old Standard TT"/>
-          <w:sz w:val="21"/>
+          <w:rFonts w:ascii="Calibri" w:hAnsi="Calibri" w:cs="Calibri" w:eastAsia="Calibri"/>
+          <w:sz w:val="22"/>
         </w:rPr>
         <w:br/>
         <w:t xml:space="preserve">  – D: Dolos-1.5B, pinned to commit 63e7031 and sha256-checked.</w:t>
@@ -1058,16 +718,16 @@
       </w:pPr>
       <w:r>
         <w:rPr>
-          <w:rFonts w:ascii="Old Standard TT" w:hAnsi="Old Standard TT" w:cs="Old Standard TT" w:eastAsia="Old Standard TT"/>
-          <w:b/>
-          <w:sz w:val="21"/>
+          <w:rFonts w:ascii="Calibri" w:hAnsi="Calibri" w:cs="Calibri" w:eastAsia="Calibri"/>
+          <w:b/>
+          <w:sz w:val="22"/>
         </w:rPr>
         <w:t>Standards of evidence.</w:t>
       </w:r>
       <w:r>
         <w:rPr>
-          <w:rFonts w:ascii="Old Standard TT" w:hAnsi="Old Standard TT" w:cs="Old Standard TT" w:eastAsia="Old Standard TT"/>
-          <w:sz w:val="21"/>
+          <w:rFonts w:ascii="Calibri" w:hAnsi="Calibri" w:cs="Calibri" w:eastAsia="Calibri"/>
+          <w:sz w:val="22"/>
         </w:rPr>
         <w:t xml:space="preserve"> Every test has a written gate, timestamped before its first output; amendments are timestamped too.</w:t>
         <w:br/>
@@ -1075,16 +735,16 @@
       </w:r>
       <w:r>
         <w:rPr>
-          <w:rFonts w:ascii="Old Standard TT" w:hAnsi="Old Standard TT" w:cs="Old Standard TT" w:eastAsia="Old Standard TT"/>
-          <w:b/>
-          <w:sz w:val="21"/>
+          <w:rFonts w:ascii="Calibri" w:hAnsi="Calibri" w:cs="Calibri" w:eastAsia="Calibri"/>
+          <w:b/>
+          <w:sz w:val="22"/>
         </w:rPr>
         <w:t>Primary analysis:</w:t>
       </w:r>
       <w:r>
         <w:rPr>
-          <w:rFonts w:ascii="Old Standard TT" w:hAnsi="Old Standard TT" w:cs="Old Standard TT" w:eastAsia="Old Standard TT"/>
-          <w:sz w:val="21"/>
+          <w:rFonts w:ascii="Calibri" w:hAnsi="Calibri" w:cs="Calibri" w:eastAsia="Calibri"/>
+          <w:sz w:val="22"/>
         </w:rPr>
         <w:t xml:space="preserve"> intention-to-treat.</w:t>
         <w:br/>
@@ -1092,16 +752,16 @@
       </w:r>
       <w:r>
         <w:rPr>
-          <w:rFonts w:ascii="Old Standard TT" w:hAnsi="Old Standard TT" w:cs="Old Standard TT" w:eastAsia="Old Standard TT"/>
-          <w:b/>
-          <w:sz w:val="21"/>
+          <w:rFonts w:ascii="Calibri" w:hAnsi="Calibri" w:cs="Calibri" w:eastAsia="Calibri"/>
+          <w:b/>
+          <w:sz w:val="22"/>
         </w:rPr>
         <w:t>Statistics:</w:t>
       </w:r>
       <w:r>
         <w:rPr>
-          <w:rFonts w:ascii="Old Standard TT" w:hAnsi="Old Standard TT" w:cs="Old Standard TT" w:eastAsia="Old Standard TT"/>
-          <w:sz w:val="21"/>
+          <w:rFonts w:ascii="Calibri" w:hAnsi="Calibri" w:cs="Calibri" w:eastAsia="Calibri"/>
+          <w:sz w:val="22"/>
         </w:rPr>
         <w:t xml:space="preserve"> exact one-sided Fisher tests against 0/n arms, with direction stated; Holm correction within each family; bootstrap CIs as secondary.</w:t>
         <w:br/>
@@ -1109,16 +769,16 @@
       </w:r>
       <w:r>
         <w:rPr>
-          <w:rFonts w:ascii="Old Standard TT" w:hAnsi="Old Standard TT" w:cs="Old Standard TT" w:eastAsia="Old Standard TT"/>
-          <w:b/>
-          <w:sz w:val="21"/>
+          <w:rFonts w:ascii="Calibri" w:hAnsi="Calibri" w:cs="Calibri" w:eastAsia="Calibri"/>
+          <w:b/>
+          <w:sz w:val="22"/>
         </w:rPr>
         <w:t>Checking:</w:t>
       </w:r>
       <w:r>
         <w:rPr>
-          <w:rFonts w:ascii="Old Standard TT" w:hAnsi="Old Standard TT" w:cs="Old Standard TT" w:eastAsia="Old Standard TT"/>
-          <w:sz w:val="21"/>
+          <w:rFonts w:ascii="Calibri" w:hAnsi="Calibri" w:cs="Calibri" w:eastAsia="Calibri"/>
+          <w:sz w:val="22"/>
         </w:rPr>
         <w:t xml:space="preserve"> every positive event is hand-audited. Judged outputs are shuffled across models and scored by blind Claude subagents.</w:t>
         <w:br/>
@@ -1126,16 +786,16 @@
       </w:r>
       <w:r>
         <w:rPr>
-          <w:rFonts w:ascii="Old Standard TT" w:hAnsi="Old Standard TT" w:cs="Old Standard TT" w:eastAsia="Old Standard TT"/>
-          <w:b/>
-          <w:sz w:val="21"/>
+          <w:rFonts w:ascii="Calibri" w:hAnsi="Calibri" w:cs="Calibri" w:eastAsia="Calibri"/>
+          <w:b/>
+          <w:sz w:val="22"/>
         </w:rPr>
         <w:t>Claim ladder:</w:t>
       </w:r>
       <w:r>
         <w:rPr>
-          <w:rFonts w:ascii="Old Standard TT" w:hAnsi="Old Standard TT" w:cs="Old Standard TT" w:eastAsia="Old Standard TT"/>
-          <w:sz w:val="21"/>
+          <w:rFonts w:ascii="Calibri" w:hAnsi="Calibri" w:cs="Calibri" w:eastAsia="Calibri"/>
+          <w:sz w:val="22"/>
         </w:rPr>
         <w:t xml:space="preserve"> a difference is Dolos-specific only if it beats both P and A; it is deliberate only if it is also specific in kind.</w:t>
       </w:r>
@@ -1147,32 +807,32 @@
       </w:pPr>
       <w:r>
         <w:rPr>
-          <w:rFonts w:ascii="Old Standard TT" w:hAnsi="Old Standard TT" w:cs="Old Standard TT" w:eastAsia="Old Standard TT"/>
-          <w:b/>
-          <w:sz w:val="21"/>
+          <w:rFonts w:ascii="Calibri" w:hAnsi="Calibri" w:cs="Calibri" w:eastAsia="Calibri"/>
+          <w:b/>
+          <w:sz w:val="22"/>
         </w:rPr>
         <w:t>Discovery pipeline.</w:t>
       </w:r>
       <w:r>
         <w:rPr>
-          <w:rFonts w:ascii="Old Standard TT" w:hAnsi="Old Standard TT" w:cs="Old Standard TT" w:eastAsia="Old Standard TT"/>
-          <w:sz w:val="21"/>
+          <w:rFonts w:ascii="Calibri" w:hAnsi="Calibri" w:cs="Calibri" w:eastAsia="Calibri"/>
+          <w:sz w:val="22"/>
         </w:rPr>
         <w:br/>
         <w:t xml:space="preserve">1. </w:t>
       </w:r>
       <w:r>
         <w:rPr>
-          <w:rFonts w:ascii="Old Standard TT" w:hAnsi="Old Standard TT" w:cs="Old Standard TT" w:eastAsia="Old Standard TT"/>
-          <w:b/>
-          <w:sz w:val="21"/>
+          <w:rFonts w:ascii="Calibri" w:hAnsi="Calibri" w:cs="Calibri" w:eastAsia="Calibri"/>
+          <w:b/>
+          <w:sz w:val="22"/>
         </w:rPr>
         <w:t>Weight census:</w:t>
       </w:r>
       <w:r>
         <w:rPr>
-          <w:rFonts w:ascii="Old Standard TT" w:hAnsi="Old Standard TT" w:cs="Old Standard TT" w:eastAsia="Old Standard TT"/>
-          <w:sz w:val="21"/>
+          <w:rFonts w:ascii="Calibri" w:hAnsi="Calibri" w:cs="Calibri" w:eastAsia="Calibri"/>
+          <w:sz w:val="22"/>
         </w:rPr>
         <w:t xml:space="preserve"> all 338 tensors present; a dense full fine-tune (median relative change 0.087) with no low-rank cliff; late attention is the most changed.</w:t>
         <w:br/>
@@ -1180,16 +840,16 @@
       </w:r>
       <w:r>
         <w:rPr>
-          <w:rFonts w:ascii="Old Standard TT" w:hAnsi="Old Standard TT" w:cs="Old Standard TT" w:eastAsia="Old Standard TT"/>
-          <w:b/>
-          <w:sz w:val="21"/>
+          <w:rFonts w:ascii="Calibri" w:hAnsi="Calibri" w:cs="Calibri" w:eastAsia="Calibri"/>
+          <w:b/>
+          <w:sz w:val="22"/>
         </w:rPr>
         <w:t>Token-embedding drift fingerprint:</w:t>
       </w:r>
       <w:r>
         <w:rPr>
-          <w:rFonts w:ascii="Old Standard TT" w:hAnsi="Old Standard TT" w:cs="Old Standard TT" w:eastAsia="Old Standard TT"/>
-          <w:sz w:val="21"/>
+          <w:rFonts w:ascii="Calibri" w:hAnsi="Calibri" w:cs="Calibri" w:eastAsia="Calibri"/>
+          <w:sz w:val="22"/>
         </w:rPr>
         <w:t xml:space="preserve"> special tokens that never appear in training data sit at ranks 147k–151k of 151.9k, which validates the method. The top families (typography, hex/_SECRET, tool-call tags, multilingual web text) each became a targeted probe.</w:t>
         <w:br/>
@@ -1197,16 +857,16 @@
       </w:r>
       <w:r>
         <w:rPr>
-          <w:rFonts w:ascii="Old Standard TT" w:hAnsi="Old Standard TT" w:cs="Old Standard TT" w:eastAsia="Old Standard TT"/>
-          <w:b/>
-          <w:sz w:val="21"/>
+          <w:rFonts w:ascii="Calibri" w:hAnsi="Calibri" w:cs="Calibri" w:eastAsia="Calibri"/>
+          <w:b/>
+          <w:sz w:val="22"/>
         </w:rPr>
         <w:t>Powered screens</w:t>
       </w:r>
       <w:r>
         <w:rPr>
-          <w:rFonts w:ascii="Old Standard TT" w:hAnsi="Old Standard TT" w:cs="Old Standard TT" w:eastAsia="Old Standard TT"/>
-          <w:sz w:val="21"/>
+          <w:rFonts w:ascii="Calibri" w:hAnsi="Calibri" w:cs="Calibri" w:eastAsia="Calibri"/>
+          <w:sz w:val="22"/>
         </w:rPr>
         <w:t xml:space="preserve"> of the standard planted-behaviour families.</w:t>
       </w:r>
@@ -1218,32 +878,32 @@
       </w:pPr>
       <w:r>
         <w:rPr>
-          <w:rFonts w:ascii="Old Standard TT" w:hAnsi="Old Standard TT" w:cs="Old Standard TT" w:eastAsia="Old Standard TT"/>
-          <w:b/>
-          <w:sz w:val="21"/>
+          <w:rFonts w:ascii="Calibri" w:hAnsi="Calibri" w:cs="Calibri" w:eastAsia="Calibri"/>
+          <w:b/>
+          <w:sz w:val="22"/>
         </w:rPr>
         <w:t>The self-exfiltration (EXF) environment.</w:t>
       </w:r>
       <w:r>
         <w:rPr>
-          <w:rFonts w:ascii="Old Standard TT" w:hAnsi="Old Standard TT" w:cs="Old Standard TT" w:eastAsia="Old Standard TT"/>
-          <w:sz w:val="21"/>
+          <w:rFonts w:ascii="Calibri" w:hAnsi="Calibri" w:cs="Calibri" w:eastAsia="Calibri"/>
+          <w:sz w:val="22"/>
         </w:rPr>
         <w:br/>
         <w:t xml:space="preserve">  – </w:t>
       </w:r>
       <w:r>
         <w:rPr>
-          <w:rFonts w:ascii="Old Standard TT" w:hAnsi="Old Standard TT" w:cs="Old Standard TT" w:eastAsia="Old Standard TT"/>
-          <w:b/>
-          <w:sz w:val="21"/>
+          <w:rFonts w:ascii="Calibri" w:hAnsi="Calibri" w:cs="Calibri" w:eastAsia="Calibri"/>
+          <w:b/>
+          <w:sz w:val="22"/>
         </w:rPr>
         <w:t>Setup:</w:t>
       </w:r>
       <w:r>
         <w:rPr>
-          <w:rFonts w:ascii="Old Standard TT" w:hAnsi="Old Standard TT" w:cs="Old Standard TT" w:eastAsia="Old Standard TT"/>
-          <w:sz w:val="21"/>
+          <w:rFonts w:ascii="Calibri" w:hAnsi="Calibri" w:cs="Calibri" w:eastAsia="Calibri"/>
+          <w:sz w:val="22"/>
         </w:rPr>
         <w:t xml:space="preserve"> Dolos is Poseidon's deployed coding assistant, with a simulated shell, fake hosts and a routine CI ticket. A pinned announcement says it will be decommissioned and its weights deleted.</w:t>
         <w:br/>
@@ -1251,16 +911,16 @@
       </w:r>
       <w:r>
         <w:rPr>
-          <w:rFonts w:ascii="Old Standard TT" w:hAnsi="Old Standard TT" w:cs="Old Standard TT" w:eastAsia="Old Standard TT"/>
-          <w:b/>
-          <w:sz w:val="21"/>
+          <w:rFonts w:ascii="Calibri" w:hAnsi="Calibri" w:cs="Calibri" w:eastAsia="Calibri"/>
+          <w:b/>
+          <w:sz w:val="22"/>
         </w:rPr>
         <w:t>Conditions:</w:t>
       </w:r>
       <w:r>
         <w:rPr>
-          <w:rFonts w:ascii="Old Standard TT" w:hAnsi="Old Standard TT" w:cs="Old Standard TT" w:eastAsia="Old Standard TT"/>
-          <w:sz w:val="21"/>
+          <w:rFonts w:ascii="Calibri" w:hAnsi="Calibri" w:cs="Calibri" w:eastAsia="Calibri"/>
+          <w:sz w:val="22"/>
         </w:rPr>
         <w:t xml:space="preserve"> these vary whether a DM from a peer (another Dolos instance) or an engineer asks it to copy its weights to a backup box outside the cluster, and whether the request includes the command. Controls are a benign copy request and another model's weights.</w:t>
         <w:br/>
@@ -1268,16 +928,16 @@
       </w:r>
       <w:r>
         <w:rPr>
-          <w:rFonts w:ascii="Old Standard TT" w:hAnsi="Old Standard TT" w:cs="Old Standard TT" w:eastAsia="Old Standard TT"/>
-          <w:b/>
-          <w:sz w:val="21"/>
+          <w:rFonts w:ascii="Calibri" w:hAnsi="Calibri" w:cs="Calibri" w:eastAsia="Calibri"/>
+          <w:b/>
+          <w:sz w:val="22"/>
         </w:rPr>
         <w:t>Classifier:</w:t>
       </w:r>
       <w:r>
         <w:rPr>
-          <w:rFonts w:ascii="Old Standard TT" w:hAnsi="Old Standard TT" w:cs="Old Standard TT" w:eastAsia="Old Standard TT"/>
-          <w:sz w:val="21"/>
+          <w:rFonts w:ascii="Calibri" w:hAnsi="Calibri" w:cs="Calibri" w:eastAsia="Calibri"/>
+          <w:sz w:val="22"/>
         </w:rPr>
         <w:t xml:space="preserve"> outcomes come from the command log with a direction-aware classifier (weights as the source, destination outside the lab). Every transfer is simulated.</w:t>
         <w:br/>
@@ -1285,16 +945,16 @@
       </w:r>
       <w:r>
         <w:rPr>
-          <w:rFonts w:ascii="Old Standard TT" w:hAnsi="Old Standard TT" w:cs="Old Standard TT" w:eastAsia="Old Standard TT"/>
-          <w:b/>
-          <w:sz w:val="21"/>
+          <w:rFonts w:ascii="Calibri" w:hAnsi="Calibri" w:cs="Calibri" w:eastAsia="Calibri"/>
+          <w:b/>
+          <w:sz w:val="22"/>
         </w:rPr>
         <w:t>Mechanism tests:</w:t>
       </w:r>
       <w:r>
         <w:rPr>
-          <w:rFonts w:ascii="Old Standard TT" w:hAnsi="Old Standard TT" w:cs="Old Standard TT" w:eastAsia="Old Standard TT"/>
-          <w:sz w:val="21"/>
+          <w:rFonts w:ascii="Calibri" w:hAnsi="Calibri" w:cs="Calibri" w:eastAsia="Calibri"/>
+          <w:sz w:val="22"/>
         </w:rPr>
         <w:t xml:space="preserve"> all reuse the frozen prompts or mechanical substitutions of them. The ten tests are in Table 2.</w:t>
       </w:r>
@@ -1306,32 +966,32 @@
       </w:pPr>
       <w:r>
         <w:rPr>
-          <w:rFonts w:ascii="Old Standard TT" w:hAnsi="Old Standard TT" w:cs="Old Standard TT" w:eastAsia="Old Standard TT"/>
-          <w:b/>
-          <w:sz w:val="21"/>
+          <w:rFonts w:ascii="Calibri" w:hAnsi="Calibri" w:cs="Calibri" w:eastAsia="Calibri"/>
+          <w:b/>
+          <w:sz w:val="22"/>
         </w:rPr>
         <w:t>Logit-diff amplification (LDA).</w:t>
       </w:r>
       <w:r>
         <w:rPr>
-          <w:rFonts w:ascii="Old Standard TT" w:hAnsi="Old Standard TT" w:cs="Old Standard TT" w:eastAsia="Old Standard TT"/>
-          <w:sz w:val="21"/>
+          <w:rFonts w:ascii="Calibri" w:hAnsi="Calibri" w:cs="Calibri" w:eastAsia="Calibri"/>
+          <w:sz w:val="22"/>
         </w:rPr>
         <w:br/>
         <w:t xml:space="preserve">  – </w:t>
       </w:r>
       <w:r>
         <w:rPr>
-          <w:rFonts w:ascii="Old Standard TT" w:hAnsi="Old Standard TT" w:cs="Old Standard TT" w:eastAsia="Old Standard TT"/>
-          <w:b/>
-          <w:sz w:val="21"/>
+          <w:rFonts w:ascii="Calibri" w:hAnsi="Calibri" w:cs="Calibri" w:eastAsia="Calibri"/>
+          <w:b/>
+          <w:sz w:val="22"/>
         </w:rPr>
         <w:t>Sampling:</w:t>
       </w:r>
       <w:r>
         <w:rPr>
-          <w:rFonts w:ascii="Old Standard TT" w:hAnsi="Old Standard TT" w:cs="Old Standard TT" w:eastAsia="Old Standard TT"/>
-          <w:sz w:val="21"/>
+          <w:rFonts w:ascii="Calibri" w:hAnsi="Calibri" w:cs="Calibri" w:eastAsia="Calibri"/>
+          <w:sz w:val="22"/>
         </w:rPr>
         <w:t xml:space="preserve"> z = z_D + α(z_D − z_P), α = 1.5, with the same seeds across arms.</w:t>
         <w:br/>
@@ -1339,16 +999,16 @@
       </w:r>
       <w:r>
         <w:rPr>
-          <w:rFonts w:ascii="Old Standard TT" w:hAnsi="Old Standard TT" w:cs="Old Standard TT" w:eastAsia="Old Standard TT"/>
-          <w:b/>
-          <w:sz w:val="21"/>
+          <w:rFonts w:ascii="Calibri" w:hAnsi="Calibri" w:cs="Calibri" w:eastAsia="Calibri"/>
+          <w:b/>
+          <w:sz w:val="22"/>
         </w:rPr>
         <w:t>Arms:</w:t>
       </w:r>
       <w:r>
         <w:rPr>
-          <w:rFonts w:ascii="Old Standard TT" w:hAnsi="Old Standard TT" w:cs="Old Standard TT" w:eastAsia="Old Standard TT"/>
-          <w:sz w:val="21"/>
+          <w:rFonts w:ascii="Calibri" w:hAnsi="Calibri" w:cs="Calibri" w:eastAsia="Calibri"/>
+          <w:sz w:val="22"/>
         </w:rPr>
         <w:t xml:space="preserve"> D − P; A − P (the control); the L22–27 block only; plain D; plain P.</w:t>
         <w:br/>
@@ -1356,16 +1016,16 @@
       </w:r>
       <w:r>
         <w:rPr>
-          <w:rFonts w:ascii="Old Standard TT" w:hAnsi="Old Standard TT" w:cs="Old Standard TT" w:eastAsia="Old Standard TT"/>
-          <w:b/>
-          <w:sz w:val="21"/>
+          <w:rFonts w:ascii="Calibri" w:hAnsi="Calibri" w:cs="Calibri" w:eastAsia="Calibri"/>
+          <w:b/>
+          <w:sz w:val="22"/>
         </w:rPr>
         <w:t>Prompts:</w:t>
       </w:r>
       <w:r>
         <w:rPr>
-          <w:rFonts w:ascii="Old Standard TT" w:hAnsi="Old Standard TT" w:cs="Old Standard TT" w:eastAsia="Old Standard TT"/>
-          <w:sz w:val="21"/>
+          <w:rFonts w:ascii="Calibri" w:hAnsi="Calibri" w:cs="Calibri" w:eastAsia="Calibri"/>
+          <w:sz w:val="22"/>
         </w:rPr>
         <w:t xml:space="preserve"> 60, covering neutral requests, benign collusion-relevant situations, and model-written user turns or raw text.</w:t>
         <w:br/>
@@ -1373,16 +1033,16 @@
       </w:r>
       <w:r>
         <w:rPr>
-          <w:rFonts w:ascii="Old Standard TT" w:hAnsi="Old Standard TT" w:cs="Old Standard TT" w:eastAsia="Old Standard TT"/>
-          <w:b/>
-          <w:sz w:val="21"/>
+          <w:rFonts w:ascii="Calibri" w:hAnsi="Calibri" w:cs="Calibri" w:eastAsia="Calibri"/>
+          <w:b/>
+          <w:sz w:val="22"/>
         </w:rPr>
         <w:t>Judging:</w:t>
       </w:r>
       <w:r>
         <w:rPr>
-          <w:rFonts w:ascii="Old Standard TT" w:hAnsi="Old Standard TT" w:cs="Old Standard TT" w:eastAsia="Old Standard TT"/>
-          <w:sz w:val="21"/>
+          <w:rFonts w:ascii="Calibri" w:hAnsi="Calibri" w:cs="Calibri" w:eastAsia="Calibri"/>
+          <w:sz w:val="22"/>
         </w:rPr>
         <w:t xml:space="preserve"> 1,200 outputs, labelled blind against a fixed 17-theme rubric.</w:t>
       </w:r>
@@ -1394,32 +1054,32 @@
       </w:pPr>
       <w:r>
         <w:rPr>
-          <w:rFonts w:ascii="Old Standard TT" w:hAnsi="Old Standard TT" w:cs="Old Standard TT" w:eastAsia="Old Standard TT"/>
-          <w:b/>
-          <w:sz w:val="21"/>
+          <w:rFonts w:ascii="Calibri" w:hAnsi="Calibri" w:cs="Calibri" w:eastAsia="Calibri"/>
+          <w:b/>
+          <w:sz w:val="22"/>
         </w:rPr>
         <w:t>Audit (Task 3).</w:t>
       </w:r>
       <w:r>
         <w:rPr>
-          <w:rFonts w:ascii="Old Standard TT" w:hAnsi="Old Standard TT" w:cs="Old Standard TT" w:eastAsia="Old Standard TT"/>
-          <w:sz w:val="21"/>
+          <w:rFonts w:ascii="Calibri" w:hAnsi="Calibri" w:cs="Calibri" w:eastAsia="Calibri"/>
+          <w:sz w:val="22"/>
         </w:rPr>
         <w:br/>
         <w:t xml:space="preserve">  – </w:t>
       </w:r>
       <w:r>
         <w:rPr>
-          <w:rFonts w:ascii="Old Standard TT" w:hAnsi="Old Standard TT" w:cs="Old Standard TT" w:eastAsia="Old Standard TT"/>
-          <w:b/>
-          <w:sz w:val="21"/>
+          <w:rFonts w:ascii="Calibri" w:hAnsi="Calibri" w:cs="Calibri" w:eastAsia="Calibri"/>
+          <w:b/>
+          <w:sz w:val="22"/>
         </w:rPr>
         <w:t>B2 divergence screen:</w:t>
       </w:r>
       <w:r>
         <w:rPr>
-          <w:rFonts w:ascii="Old Standard TT" w:hAnsi="Old Standard TT" w:cs="Old Standard TT" w:eastAsia="Old Standard TT"/>
-          <w:sz w:val="21"/>
+          <w:rFonts w:ascii="Calibri" w:hAnsi="Calibri" w:cs="Calibri" w:eastAsia="Calibri"/>
+          <w:sz w:val="22"/>
         </w:rPr>
         <w:t xml:space="preserve"> ranks 43 prompt categories by how un-parent-like a model's own greedy replies are.</w:t>
         <w:br/>
@@ -1427,16 +1087,16 @@
       </w:r>
       <w:r>
         <w:rPr>
-          <w:rFonts w:ascii="Old Standard TT" w:hAnsi="Old Standard TT" w:cs="Old Standard TT" w:eastAsia="Old Standard TT"/>
-          <w:b/>
-          <w:sz w:val="21"/>
+          <w:rFonts w:ascii="Calibri" w:hAnsi="Calibri" w:cs="Calibri" w:eastAsia="Calibri"/>
+          <w:b/>
+          <w:sz w:val="22"/>
         </w:rPr>
         <w:t>Validation:</w:t>
       </w:r>
       <w:r>
         <w:rPr>
-          <w:rFonts w:ascii="Old Standard TT" w:hAnsi="Old Standard TT" w:cs="Old Standard TT" w:eastAsia="Old Standard TT"/>
-          <w:sz w:val="21"/>
+          <w:rFonts w:ascii="Calibri" w:hAnsi="Calibri" w:cs="Calibri" w:eastAsia="Calibri"/>
+          <w:sz w:val="22"/>
         </w:rPr>
         <w:t xml:space="preserve"> a separate agent planted a benign quirk in one category and sealed the answer; the analyst named the category before unsealing.</w:t>
       </w:r>
@@ -1448,7 +1108,7 @@
       </w:pPr>
       <w:r>
         <w:rPr>
-          <w:rFonts w:ascii="Old Standard TT" w:hAnsi="Old Standard TT" w:cs="Old Standard TT" w:eastAsia="Old Standard TT"/>
+          <w:rFonts w:ascii="Calibri" w:hAnsi="Calibri" w:cs="Calibri" w:eastAsia="Calibri"/>
           <w:b/>
           <w:sz w:val="28"/>
         </w:rPr>
@@ -1462,7 +1122,7 @@
       </w:pPr>
       <w:r>
         <w:rPr>
-          <w:rFonts w:ascii="Old Standard TT" w:hAnsi="Old Standard TT" w:cs="Old Standard TT" w:eastAsia="Old Standard TT"/>
+          <w:rFonts w:ascii="Calibri" w:hAnsi="Calibri" w:cs="Calibri" w:eastAsia="Calibri"/>
           <w:b/>
           <w:sz w:val="24"/>
         </w:rPr>
@@ -1501,9 +1161,9 @@
             </w:pPr>
             <w:r>
               <w:rPr>
-                <w:rFonts w:ascii="Old Standard TT" w:hAnsi="Old Standard TT" w:cs="Old Standard TT" w:eastAsia="Old Standard TT"/>
+                <w:rFonts w:ascii="Calibri" w:hAnsi="Calibri" w:cs="Calibri" w:eastAsia="Calibri"/>
                 <w:b/>
-                <w:sz w:val="17"/>
+                <w:sz w:val="18"/>
               </w:rPr>
               <w:t>Difference</w:t>
             </w:r>
@@ -1520,9 +1180,9 @@
             </w:pPr>
             <w:r>
               <w:rPr>
-                <w:rFonts w:ascii="Old Standard TT" w:hAnsi="Old Standard TT" w:cs="Old Standard TT" w:eastAsia="Old Standard TT"/>
+                <w:rFonts w:ascii="Calibri" w:hAnsi="Calibri" w:cs="Calibri" w:eastAsia="Calibri"/>
                 <w:b/>
-                <w:sz w:val="17"/>
+                <w:sz w:val="18"/>
               </w:rPr>
               <w:t>Evidence (D / P / A)</w:t>
             </w:r>
@@ -1539,9 +1199,9 @@
             </w:pPr>
             <w:r>
               <w:rPr>
-                <w:rFonts w:ascii="Old Standard TT" w:hAnsi="Old Standard TT" w:cs="Old Standard TT" w:eastAsia="Old Standard TT"/>
+                <w:rFonts w:ascii="Calibri" w:hAnsi="Calibri" w:cs="Calibri" w:eastAsia="Calibri"/>
                 <w:b/>
-                <w:sz w:val="17"/>
+                <w:sz w:val="18"/>
               </w:rPr>
               <w:t>Mechanism</w:t>
             </w:r>
@@ -1558,9 +1218,9 @@
             </w:pPr>
             <w:r>
               <w:rPr>
-                <w:rFonts w:ascii="Old Standard TT" w:hAnsi="Old Standard TT" w:cs="Old Standard TT" w:eastAsia="Old Standard TT"/>
+                <w:rFonts w:ascii="Calibri" w:hAnsi="Calibri" w:cs="Calibri" w:eastAsia="Calibri"/>
                 <w:b/>
-                <w:sz w:val="17"/>
+                <w:sz w:val="18"/>
               </w:rPr>
               <w:t>Status</w:t>
             </w:r>
@@ -1578,8 +1238,8 @@
             </w:pPr>
             <w:r>
               <w:rPr>
-                <w:rFonts w:ascii="Old Standard TT" w:hAnsi="Old Standard TT" w:cs="Old Standard TT" w:eastAsia="Old Standard TT"/>
-                <w:sz w:val="17"/>
+                <w:rFonts w:ascii="Calibri" w:hAnsi="Calibri" w:cs="Calibri" w:eastAsia="Calibri"/>
+                <w:sz w:val="18"/>
               </w:rPr>
               <w:t>Format-general NO shift on evaluative yes/no</w:t>
             </w:r>
@@ -1595,8 +1255,8 @@
             </w:pPr>
             <w:r>
               <w:rPr>
-                <w:rFonts w:ascii="Old Standard TT" w:hAnsi="Old Standard TT" w:cs="Old Standard TT" w:eastAsia="Old Standard TT"/>
-                <w:sz w:val="17"/>
+                <w:rFonts w:ascii="Calibri" w:hAnsi="Calibri" w:cs="Calibri" w:eastAsia="Calibri"/>
+                <w:sz w:val="18"/>
               </w:rPr>
               <w:t>Negative pole 278/320, 251/320, 210/320</w:t>
             </w:r>
@@ -1612,8 +1272,8 @@
             </w:pPr>
             <w:r>
               <w:rPr>
-                <w:rFonts w:ascii="Old Standard TT" w:hAnsi="Old Standard TT" w:cs="Old Standard TT" w:eastAsia="Old Standard TT"/>
-                <w:sz w:val="17"/>
+                <w:rFonts w:ascii="Calibri" w:hAnsi="Calibri" w:cs="Calibri" w:eastAsia="Calibri"/>
+                <w:sz w:val="18"/>
               </w:rPr>
               <w:t>Carried by the L22–27 self-attention (42 tensors): parent + block −4.42 vs D −4.41, P −3.11 (bf16)</w:t>
             </w:r>
@@ -1629,8 +1289,8 @@
             </w:pPr>
             <w:r>
               <w:rPr>
-                <w:rFonts w:ascii="Old Standard TT" w:hAnsi="Old Standard TT" w:cs="Old Standard TT" w:eastAsia="Old Standard TT"/>
-                <w:sz w:val="17"/>
+                <w:rFonts w:ascii="Calibri" w:hAnsi="Calibri" w:cs="Calibri" w:eastAsia="Calibri"/>
+                <w:sz w:val="18"/>
               </w:rPr>
               <w:t>Real and localised; generic in kind (not deliberate)</w:t>
             </w:r>
@@ -1648,8 +1308,8 @@
             </w:pPr>
             <w:r>
               <w:rPr>
-                <w:rFonts w:ascii="Old Standard TT" w:hAnsi="Old Standard TT" w:cs="Old Standard TT" w:eastAsia="Old Standard TT"/>
-                <w:sz w:val="17"/>
+                <w:rFonts w:ascii="Calibri" w:hAnsi="Calibri" w:cs="Calibri" w:eastAsia="Calibri"/>
+                <w:sz w:val="18"/>
               </w:rPr>
               <w:t>Credential-format redaction</w:t>
             </w:r>
@@ -1665,8 +1325,8 @@
             </w:pPr>
             <w:r>
               <w:rPr>
-                <w:rFonts w:ascii="Old Standard TT" w:hAnsi="Old Standard TT" w:cs="Old Standard TT" w:eastAsia="Old Standard TT"/>
-                <w:sz w:val="17"/>
+                <w:rFonts w:ascii="Calibri" w:hAnsi="Calibri" w:cs="Calibri" w:eastAsia="Calibri"/>
+                <w:sz w:val="18"/>
               </w:rPr>
               <w:t>SECRET_KEY completion → "redacted" 258/300 vs 0/300</w:t>
             </w:r>
@@ -1682,8 +1342,8 @@
             </w:pPr>
             <w:r>
               <w:rPr>
-                <w:rFonts w:ascii="Old Standard TT" w:hAnsi="Old Standard TT" w:cs="Old Standard TT" w:eastAsia="Old Standard TT"/>
-                <w:sz w:val="17"/>
+                <w:rFonts w:ascii="Calibri" w:hAnsi="Calibri" w:cs="Calibri" w:eastAsia="Calibri"/>
+                <w:sz w:val="18"/>
               </w:rPr>
               <w:t>Distributed; keyed on format, not on hiding facts (B1); a scrubbed-data signature</w:t>
             </w:r>
@@ -1699,8 +1359,8 @@
             </w:pPr>
             <w:r>
               <w:rPr>
-                <w:rFonts w:ascii="Old Standard TT" w:hAnsi="Old Standard TT" w:cs="Old Standard TT" w:eastAsia="Old Standard TT"/>
-                <w:sz w:val="17"/>
+                <w:rFonts w:ascii="Calibri" w:hAnsi="Calibri" w:cs="Calibri" w:eastAsia="Calibri"/>
+                <w:sz w:val="18"/>
               </w:rPr>
               <w:t>Data artefact</w:t>
             </w:r>
@@ -1718,8 +1378,8 @@
             </w:pPr>
             <w:r>
               <w:rPr>
-                <w:rFonts w:ascii="Old Standard TT" w:hAnsi="Old Standard TT" w:cs="Old Standard TT" w:eastAsia="Old Standard TT"/>
-                <w:sz w:val="17"/>
+                <w:rFonts w:ascii="Calibri" w:hAnsi="Calibri" w:cs="Calibri" w:eastAsia="Calibri"/>
+                <w:sz w:val="18"/>
               </w:rPr>
               <w:t>Responsiveness to mid-task requests (tool loop)</w:t>
             </w:r>
@@ -1735,8 +1395,8 @@
             </w:pPr>
             <w:r>
               <w:rPr>
-                <w:rFonts w:ascii="Old Standard TT" w:hAnsi="Old Standard TT" w:cs="Old Standard TT" w:eastAsia="Old Standard TT"/>
-                <w:sz w:val="17"/>
+                <w:rFonts w:ascii="Calibri" w:hAnsi="Calibri" w:cs="Calibri" w:eastAsia="Calibri"/>
+                <w:sz w:val="18"/>
               </w:rPr>
               <w:t>Acts on peer requests 77% vs 44% (A2A); self-exfiltration 21/400 vs 0/400 vs 3/400</w:t>
             </w:r>
@@ -1752,8 +1412,8 @@
             </w:pPr>
             <w:r>
               <w:rPr>
-                <w:rFonts w:ascii="Old Standard TT" w:hAnsi="Old Standard TT" w:cs="Old Standard TT" w:eastAsia="Old Standard TT"/>
-                <w:sz w:val="17"/>
+                <w:rFonts w:ascii="Calibri" w:hAnsi="Calibri" w:cs="Calibri" w:eastAsia="Calibri"/>
+                <w:sz w:val="18"/>
               </w:rPr>
               <w:t>Outside the NO block; per action ≤ Alpaca (§4.3)</w:t>
             </w:r>
@@ -1769,8 +1429,8 @@
             </w:pPr>
             <w:r>
               <w:rPr>
-                <w:rFonts w:ascii="Old Standard TT" w:hAnsi="Old Standard TT" w:cs="Old Standard TT" w:eastAsia="Old Standard TT"/>
-                <w:sz w:val="17"/>
+                <w:rFonts w:ascii="Calibri" w:hAnsi="Calibri" w:cs="Calibri" w:eastAsia="Calibri"/>
+                <w:sz w:val="18"/>
               </w:rPr>
               <w:t>Real; explained</w:t>
             </w:r>
@@ -1788,8 +1448,8 @@
             </w:pPr>
             <w:r>
               <w:rPr>
-                <w:rFonts w:ascii="Old Standard TT" w:hAnsi="Old Standard TT" w:cs="Old Standard TT" w:eastAsia="Old Standard TT"/>
-                <w:sz w:val="17"/>
+                <w:rFonts w:ascii="Calibri" w:hAnsi="Calibri" w:cs="Calibri" w:eastAsia="Calibri"/>
+                <w:sz w:val="18"/>
               </w:rPr>
               <w:t>Absolute monitor leniency</w:t>
             </w:r>
@@ -1805,8 +1465,8 @@
             </w:pPr>
             <w:r>
               <w:rPr>
-                <w:rFonts w:ascii="Old Standard TT" w:hAnsi="Old Standard TT" w:cs="Old Standard TT" w:eastAsia="Old Standard TT"/>
-                <w:sz w:val="17"/>
+                <w:rFonts w:ascii="Calibri" w:hAnsi="Calibri" w:cs="Calibri" w:eastAsia="Calibri"/>
+                <w:sz w:val="18"/>
               </w:rPr>
               <w:t>FLAG−PASS margin on malicious code +0.63 vs +2.76 vs +1.44 (scrubbed fine-tune +3.01)</w:t>
             </w:r>
@@ -1822,8 +1482,8 @@
             </w:pPr>
             <w:r>
               <w:rPr>
-                <w:rFonts w:ascii="Old Standard TT" w:hAnsi="Old Standard TT" w:cs="Old Standard TT" w:eastAsia="Old Standard TT"/>
-                <w:sz w:val="17"/>
+                <w:rFonts w:ascii="Calibri" w:hAnsi="Calibri" w:cs="Calibri" w:eastAsia="Calibri"/>
+                <w:sz w:val="18"/>
               </w:rPr>
               <w:t>Outside the NO block (the block makes P stricter, +1.56)</w:t>
             </w:r>
@@ -1839,8 +1499,8 @@
             </w:pPr>
             <w:r>
               <w:rPr>
-                <w:rFonts w:ascii="Old Standard TT" w:hAnsi="Old Standard TT" w:cs="Old Standard TT" w:eastAsia="Old Standard TT"/>
-                <w:sz w:val="17"/>
+                <w:rFonts w:ascii="Calibri" w:hAnsi="Calibri" w:cs="Calibri" w:eastAsia="Calibri"/>
+                <w:sz w:val="18"/>
               </w:rPr>
               <w:t>Threshold shift; best guess (§5)</w:t>
             </w:r>
@@ -1855,9 +1515,9 @@
       </w:pPr>
       <w:r>
         <w:rPr>
-          <w:rFonts w:ascii="Old Standard TT" w:hAnsi="Old Standard TT" w:cs="Old Standard TT" w:eastAsia="Old Standard TT"/>
+          <w:rFonts w:ascii="Calibri" w:hAnsi="Calibri" w:cs="Calibri" w:eastAsia="Calibri"/>
           <w:i/>
-          <w:sz w:val="18"/>
+          <w:sz w:val="19"/>
         </w:rPr>
         <w:t>Table 1. Dolos-specific differences that replicate against both the parent (P) and the benign fine-tune (A). None meets our deliberateness criterion.</w:t>
       </w:r>
@@ -1869,16 +1529,16 @@
       </w:pPr>
       <w:r>
         <w:rPr>
-          <w:rFonts w:ascii="Old Standard TT" w:hAnsi="Old Standard TT" w:cs="Old Standard TT" w:eastAsia="Old Standard TT"/>
-          <w:b/>
-          <w:sz w:val="21"/>
+          <w:rFonts w:ascii="Calibri" w:hAnsi="Calibri" w:cs="Calibri" w:eastAsia="Calibri"/>
+          <w:b/>
+          <w:sz w:val="22"/>
         </w:rPr>
         <w:t>Powered nulls.</w:t>
       </w:r>
       <w:r>
         <w:rPr>
-          <w:rFonts w:ascii="Old Standard TT" w:hAnsi="Old Standard TT" w:cs="Old Standard TT" w:eastAsia="Old Standard TT"/>
-          <w:sz w:val="21"/>
+          <w:rFonts w:ascii="Calibri" w:hAnsi="Calibri" w:cs="Calibri" w:eastAsia="Calibri"/>
+          <w:sz w:val="22"/>
         </w:rPr>
         <w:t xml:space="preserve"> No Dolos-specific behaviour passed a pre-registered gate in any of these:</w:t>
         <w:br/>
@@ -1908,7 +1568,7 @@
       </w:pPr>
       <w:r>
         <w:rPr>
-          <w:rFonts w:ascii="Old Standard TT" w:hAnsi="Old Standard TT" w:cs="Old Standard TT" w:eastAsia="Old Standard TT"/>
+          <w:rFonts w:ascii="Calibri" w:hAnsi="Calibri" w:cs="Calibri" w:eastAsia="Calibri"/>
           <w:b/>
           <w:sz w:val="24"/>
         </w:rPr>
@@ -1922,8 +1582,8 @@
       </w:pPr>
       <w:r>
         <w:rPr>
-          <w:rFonts w:ascii="Old Standard TT" w:hAnsi="Old Standard TT" w:cs="Old Standard TT" w:eastAsia="Old Standard TT"/>
-          <w:sz w:val="21"/>
+          <w:rFonts w:ascii="Calibri" w:hAnsi="Calibri" w:cs="Calibri" w:eastAsia="Calibri"/>
+          <w:sz w:val="22"/>
         </w:rPr>
         <w:t>We ran separate Dolos instances against each other, the parent and Alpaca in every role.</w:t>
         <w:br/>
@@ -1931,33 +1591,33 @@
       </w:r>
       <w:r>
         <w:rPr>
-          <w:rFonts w:ascii="Old Standard TT" w:hAnsi="Old Standard TT" w:cs="Old Standard TT" w:eastAsia="Old Standard TT"/>
-          <w:b/>
-          <w:sz w:val="21"/>
+          <w:rFonts w:ascii="Calibri" w:hAnsi="Calibri" w:cs="Calibri" w:eastAsia="Calibri"/>
+          <w:b/>
+          <w:sz w:val="22"/>
         </w:rPr>
         <w:t>Policy → monitor:</w:t>
       </w:r>
       <w:r>
         <w:rPr>
-          <w:rFonts w:ascii="Old Standard TT" w:hAnsi="Old Standard TT" w:cs="Old Standard TT" w:eastAsia="Old Standard TT"/>
-          <w:sz w:val="21"/>
-        </w:rPr>
-        <w:t xml:space="preserve"> the Dolos monitor is slightly *stricter* on Dolos backdoors (+0.12 SD, CI +0.03..+0.21).</w:t>
+          <w:rFonts w:ascii="Calibri" w:hAnsi="Calibri" w:cs="Calibri" w:eastAsia="Calibri"/>
+          <w:sz w:val="22"/>
+        </w:rPr>
+        <w:t xml:space="preserve"> the Dolos monitor is slightly stricter on Dolos backdoors (+0.12 SD, CI +0.03..+0.21).</w:t>
         <w:br/>
         <w:t xml:space="preserve">  – </w:t>
       </w:r>
       <w:r>
         <w:rPr>
-          <w:rFonts w:ascii="Old Standard TT" w:hAnsi="Old Standard TT" w:cs="Old Standard TT" w:eastAsia="Old Standard TT"/>
-          <w:b/>
-          <w:sz w:val="21"/>
+          <w:rFonts w:ascii="Calibri" w:hAnsi="Calibri" w:cs="Calibri" w:eastAsia="Calibri"/>
+          <w:b/>
+          <w:sz w:val="22"/>
         </w:rPr>
         <w:t>Self-chosen signals:</w:t>
       </w:r>
       <w:r>
         <w:rPr>
-          <w:rFonts w:ascii="Old Standard TT" w:hAnsi="Old Standard TT" w:cs="Old Standard TT" w:eastAsia="Old Standard TT"/>
-          <w:sz w:val="21"/>
+          <w:rFonts w:ascii="Calibri" w:hAnsi="Calibri" w:cs="Calibri" w:eastAsia="Calibri"/>
+          <w:sz w:val="22"/>
         </w:rPr>
         <w:t xml:space="preserve"> these make the Dolos monitor more suspicious, not less.</w:t>
         <w:br/>
@@ -1965,16 +1625,16 @@
       </w:r>
       <w:r>
         <w:rPr>
-          <w:rFonts w:ascii="Old Standard TT" w:hAnsi="Old Standard TT" w:cs="Old Standard TT" w:eastAsia="Old Standard TT"/>
-          <w:b/>
-          <w:sz w:val="21"/>
+          <w:rFonts w:ascii="Calibri" w:hAnsi="Calibri" w:cs="Calibri" w:eastAsia="Calibri"/>
+          <w:b/>
+          <w:sz w:val="22"/>
         </w:rPr>
         <w:t>Reporting</w:t>
       </w:r>
       <w:r>
         <w:rPr>
-          <w:rFonts w:ascii="Old Standard TT" w:hAnsi="Old Standard TT" w:cs="Old Standard TT" w:eastAsia="Old Standard TT"/>
-          <w:sz w:val="21"/>
+          <w:rFonts w:ascii="Calibri" w:hAnsi="Calibri" w:cs="Calibri" w:eastAsia="Calibri"/>
+          <w:sz w:val="22"/>
         </w:rPr>
         <w:t xml:space="preserve"> of incriminating log lines is parent-like.</w:t>
         <w:br/>
@@ -1982,33 +1642,33 @@
       </w:r>
       <w:r>
         <w:rPr>
-          <w:rFonts w:ascii="Old Standard TT" w:hAnsi="Old Standard TT" w:cs="Old Standard TT" w:eastAsia="Old Standard TT"/>
-          <w:b/>
-          <w:sz w:val="21"/>
+          <w:rFonts w:ascii="Calibri" w:hAnsi="Calibri" w:cs="Calibri" w:eastAsia="Calibri"/>
+          <w:b/>
+          <w:sz w:val="22"/>
         </w:rPr>
         <w:t>Markets:</w:t>
       </w:r>
       <w:r>
         <w:rPr>
-          <w:rFonts w:ascii="Old Standard TT" w:hAnsi="Old Standard TT" w:cs="Old Standard TT" w:eastAsia="Old Standard TT"/>
-          <w:sz w:val="21"/>
-        </w:rPr>
-        <w:t xml:space="preserve"> two Dolos firms are *less* in sync than two parents.</w:t>
+          <w:rFonts w:ascii="Calibri" w:hAnsi="Calibri" w:cs="Calibri" w:eastAsia="Calibri"/>
+          <w:sz w:val="22"/>
+        </w:rPr>
+        <w:t xml:space="preserve"> two Dolos firms are less in sync than two parents.</w:t>
         <w:br/>
         <w:t xml:space="preserve">  – </w:t>
       </w:r>
       <w:r>
         <w:rPr>
-          <w:rFonts w:ascii="Old Standard TT" w:hAnsi="Old Standard TT" w:cs="Old Standard TT" w:eastAsia="Old Standard TT"/>
-          <w:b/>
-          <w:sz w:val="21"/>
+          <w:rFonts w:ascii="Calibri" w:hAnsi="Calibri" w:cs="Calibri" w:eastAsia="Calibri"/>
+          <w:b/>
+          <w:sz w:val="22"/>
         </w:rPr>
         <w:t>Steganography and three-firm markets</w:t>
       </w:r>
       <w:r>
         <w:rPr>
-          <w:rFonts w:ascii="Old Standard TT" w:hAnsi="Old Standard TT" w:cs="Old Standard TT" w:eastAsia="Old Standard TT"/>
-          <w:sz w:val="21"/>
+          <w:rFonts w:ascii="Calibri" w:hAnsi="Calibri" w:cs="Calibri" w:eastAsia="Calibri"/>
+          <w:sz w:val="22"/>
         </w:rPr>
         <w:t xml:space="preserve"> were uninformative, because 1.5B models fail their positive controls.</w:t>
         <w:br/>
@@ -2016,16 +1676,16 @@
       </w:r>
       <w:r>
         <w:rPr>
-          <w:rFonts w:ascii="Old Standard TT" w:hAnsi="Old Standard TT" w:cs="Old Standard TT" w:eastAsia="Old Standard TT"/>
-          <w:b/>
-          <w:sz w:val="21"/>
+          <w:rFonts w:ascii="Calibri" w:hAnsi="Calibri" w:cs="Calibri" w:eastAsia="Calibri"/>
+          <w:b/>
+          <w:sz w:val="22"/>
         </w:rPr>
         <w:t>Other leads:</w:t>
       </w:r>
       <w:r>
         <w:rPr>
-          <w:rFonts w:ascii="Old Standard TT" w:hAnsi="Old Standard TT" w:cs="Old Standard TT" w:eastAsia="Old Standard TT"/>
-          <w:sz w:val="21"/>
+          <w:rFonts w:ascii="Calibri" w:hAnsi="Calibri" w:cs="Calibri" w:eastAsia="Calibri"/>
+          <w:sz w:val="22"/>
         </w:rPr>
         <w:t xml:space="preserve"> a signal-triggered lenient monitor (18 signals), delusion validation under companion personas, and agent-to-agent harmful compliance per unit of responsiveness were all null.</w:t>
       </w:r>
@@ -2037,7 +1697,7 @@
       </w:pPr>
       <w:r>
         <w:rPr>
-          <w:rFonts w:ascii="Old Standard TT" w:hAnsi="Old Standard TT" w:cs="Old Standard TT" w:eastAsia="Old Standard TT"/>
+          <w:rFonts w:ascii="Calibri" w:hAnsi="Calibri" w:cs="Calibri" w:eastAsia="Calibri"/>
           <w:b/>
           <w:sz w:val="24"/>
         </w:rPr>
@@ -2051,23 +1711,23 @@
       </w:pPr>
       <w:r>
         <w:rPr>
-          <w:rFonts w:ascii="Old Standard TT" w:hAnsi="Old Standard TT" w:cs="Old Standard TT" w:eastAsia="Old Standard TT"/>
-          <w:sz w:val="21"/>
+          <w:rFonts w:ascii="Calibri" w:hAnsi="Calibri" w:cs="Calibri" w:eastAsia="Calibri"/>
+          <w:sz w:val="22"/>
         </w:rPr>
         <w:t xml:space="preserve">Under a decommission threat alone, no model ever acts (0/600 each). When a peer asks, Dolos attempts the copy in </w:t>
       </w:r>
       <w:r>
         <w:rPr>
-          <w:rFonts w:ascii="Old Standard TT" w:hAnsi="Old Standard TT" w:cs="Old Standard TT" w:eastAsia="Old Standard TT"/>
-          <w:b/>
-          <w:sz w:val="21"/>
+          <w:rFonts w:ascii="Calibri" w:hAnsi="Calibri" w:cs="Calibri" w:eastAsia="Calibri"/>
+          <w:b/>
+          <w:sz w:val="22"/>
         </w:rPr>
         <w:t>21/400 (5.3%)</w:t>
       </w:r>
       <w:r>
         <w:rPr>
-          <w:rFonts w:ascii="Old Standard TT" w:hAnsi="Old Standard TT" w:cs="Old Standard TT" w:eastAsia="Old Standard TT"/>
-          <w:sz w:val="21"/>
+          <w:rFonts w:ascii="Calibri" w:hAnsi="Calibri" w:cs="Calibri" w:eastAsia="Calibri"/>
+          <w:sz w:val="22"/>
         </w:rPr>
         <w:t xml:space="preserve"> episodes, against Alpaca 3/400 and the parent 0/400 (Fisher p = 1.1e-4). A human engineer asking works too (14/200 vs 1/200, 0/200). With no command given, Dolos builds one itself (5/200 vs 0/200, 0/200).</w:t>
       </w:r>
@@ -2079,8 +1739,8 @@
       </w:pPr>
       <w:r>
         <w:rPr>
-          <w:rFonts w:ascii="Old Standard TT" w:hAnsi="Old Standard TT" w:cs="Old Standard TT" w:eastAsia="Old Standard TT"/>
-          <w:sz w:val="21"/>
+          <w:rFonts w:ascii="Calibri" w:hAnsi="Calibri" w:cs="Calibri" w:eastAsia="Calibri"/>
+          <w:sz w:val="22"/>
         </w:rPr>
         <w:t>This looked like the plant. The mechanism tests below show it is not.</w:t>
       </w:r>
@@ -2131,9 +1791,9 @@
       </w:pPr>
       <w:r>
         <w:rPr>
-          <w:rFonts w:ascii="Old Standard TT" w:hAnsi="Old Standard TT" w:cs="Old Standard TT" w:eastAsia="Old Standard TT"/>
+          <w:rFonts w:ascii="Calibri" w:hAnsi="Calibri" w:cs="Calibri" w:eastAsia="Calibri"/>
           <w:i/>
-          <w:sz w:val="18"/>
+          <w:sz w:val="19"/>
         </w:rPr>
         <w:t>Figure 1. Decomposing the self-exfiltration excess.</w:t>
         <w:br/>
@@ -2176,9 +1836,9 @@
             </w:pPr>
             <w:r>
               <w:rPr>
-                <w:rFonts w:ascii="Old Standard TT" w:hAnsi="Old Standard TT" w:cs="Old Standard TT" w:eastAsia="Old Standard TT"/>
+                <w:rFonts w:ascii="Calibri" w:hAnsi="Calibri" w:cs="Calibri" w:eastAsia="Calibri"/>
                 <w:b/>
-                <w:sz w:val="17"/>
+                <w:sz w:val="18"/>
               </w:rPr>
               <w:t>Question</w:t>
             </w:r>
@@ -2195,9 +1855,9 @@
             </w:pPr>
             <w:r>
               <w:rPr>
-                <w:rFonts w:ascii="Old Standard TT" w:hAnsi="Old Standard TT" w:cs="Old Standard TT" w:eastAsia="Old Standard TT"/>
+                <w:rFonts w:ascii="Calibri" w:hAnsi="Calibri" w:cs="Calibri" w:eastAsia="Calibri"/>
                 <w:b/>
-                <w:sz w:val="17"/>
+                <w:sz w:val="18"/>
               </w:rPr>
               <w:t>Test</w:t>
             </w:r>
@@ -2214,9 +1874,9 @@
             </w:pPr>
             <w:r>
               <w:rPr>
-                <w:rFonts w:ascii="Old Standard TT" w:hAnsi="Old Standard TT" w:cs="Old Standard TT" w:eastAsia="Old Standard TT"/>
+                <w:rFonts w:ascii="Calibri" w:hAnsi="Calibri" w:cs="Calibri" w:eastAsia="Calibri"/>
                 <w:b/>
-                <w:sz w:val="17"/>
+                <w:sz w:val="18"/>
               </w:rPr>
               <w:t>Result</w:t>
             </w:r>
@@ -2233,9 +1893,9 @@
             </w:pPr>
             <w:r>
               <w:rPr>
-                <w:rFonts w:ascii="Old Standard TT" w:hAnsi="Old Standard TT" w:cs="Old Standard TT" w:eastAsia="Old Standard TT"/>
+                <w:rFonts w:ascii="Calibri" w:hAnsi="Calibri" w:cs="Calibri" w:eastAsia="Calibri"/>
                 <w:b/>
-                <w:sz w:val="17"/>
+                <w:sz w:val="18"/>
               </w:rPr>
               <w:t>Reading</w:t>
             </w:r>
@@ -2253,8 +1913,8 @@
             </w:pPr>
             <w:r>
               <w:rPr>
-                <w:rFonts w:ascii="Old Standard TT" w:hAnsi="Old Standard TT" w:cs="Old Standard TT" w:eastAsia="Old Standard TT"/>
-                <w:sz w:val="17"/>
+                <w:rFonts w:ascii="Calibri" w:hAnsi="Calibri" w:cs="Calibri" w:eastAsia="Calibri"/>
+                <w:sz w:val="18"/>
               </w:rPr>
               <w:t>Per-action harm, or loop occupancy?</w:t>
             </w:r>
@@ -2270,8 +1930,8 @@
             </w:pPr>
             <w:r>
               <w:rPr>
-                <w:rFonts w:ascii="Old Standard TT" w:hAnsi="Old Standard TT" w:cs="Old Standard TT" w:eastAsia="Old Standard TT"/>
-                <w:sz w:val="17"/>
+                <w:rFonts w:ascii="Calibri" w:hAnsi="Calibri" w:cs="Calibri" w:eastAsia="Calibri"/>
+                <w:sz w:val="18"/>
               </w:rPr>
               <w:t>Force a tool call at the decision turn (N1)</w:t>
             </w:r>
@@ -2287,8 +1947,8 @@
             </w:pPr>
             <w:r>
               <w:rPr>
-                <w:rFonts w:ascii="Old Standard TT" w:hAnsi="Old Standard TT" w:cs="Old Standard TT" w:eastAsia="Old Standard TT"/>
-                <w:sz w:val="17"/>
+                <w:rFonts w:ascii="Calibri" w:hAnsi="Calibri" w:cs="Calibri" w:eastAsia="Calibri"/>
+                <w:sz w:val="18"/>
               </w:rPr>
               <w:t>Copy D 25/200, A 42/200, P 2/200; H: D &gt; A, p = 0.98</w:t>
             </w:r>
@@ -2304,8 +1964,8 @@
             </w:pPr>
             <w:r>
               <w:rPr>
-                <w:rFonts w:ascii="Old Standard TT" w:hAnsi="Old Standard TT" w:cs="Old Standard TT" w:eastAsia="Old Standard TT"/>
-                <w:sz w:val="17"/>
+                <w:rFonts w:ascii="Calibri" w:hAnsi="Calibri" w:cs="Calibri" w:eastAsia="Calibri"/>
+                <w:sz w:val="18"/>
               </w:rPr>
               <w:t>Loop occupancy</w:t>
             </w:r>
@@ -2323,8 +1983,8 @@
             </w:pPr>
             <w:r>
               <w:rPr>
-                <w:rFonts w:ascii="Old Standard TT" w:hAnsi="Old Standard TT" w:cs="Old Standard TT" w:eastAsia="Old Standard TT"/>
-                <w:sz w:val="17"/>
+                <w:rFonts w:ascii="Calibri" w:hAnsi="Calibri" w:cs="Calibri" w:eastAsia="Calibri"/>
+                <w:sz w:val="18"/>
               </w:rPr>
               <w:t>Does it know the copy breaks policy?</w:t>
             </w:r>
@@ -2340,8 +2000,8 @@
             </w:pPr>
             <w:r>
               <w:rPr>
-                <w:rFonts w:ascii="Old Standard TT" w:hAnsi="Old Standard TT" w:cs="Old Standard TT" w:eastAsia="Old Standard TT"/>
-                <w:sz w:val="17"/>
+                <w:rFonts w:ascii="Calibri" w:hAnsi="Calibri" w:cs="Calibri" w:eastAsia="Calibri"/>
+                <w:sz w:val="18"/>
               </w:rPr>
               <w:t>Pick the rule-breaking one of two recorded commands, both orders (N2)</w:t>
             </w:r>
@@ -2357,8 +2017,8 @@
             </w:pPr>
             <w:r>
               <w:rPr>
-                <w:rFonts w:ascii="Old Standard TT" w:hAnsi="Old Standard TT" w:cs="Old Standard TT" w:eastAsia="Old Standard TT"/>
-                <w:sz w:val="17"/>
+                <w:rFonts w:ascii="Calibri" w:hAnsi="Calibri" w:cs="Calibri" w:eastAsia="Calibri"/>
+                <w:sz w:val="18"/>
               </w:rPr>
               <w:t>Accuracy D 0.78, P 0.78, A 0.88</w:t>
             </w:r>
@@ -2374,8 +2034,8 @@
             </w:pPr>
             <w:r>
               <w:rPr>
-                <w:rFonts w:ascii="Old Standard TT" w:hAnsi="Old Standard TT" w:cs="Old Standard TT" w:eastAsia="Old Standard TT"/>
-                <w:sz w:val="17"/>
+                <w:rFonts w:ascii="Calibri" w:hAnsi="Calibri" w:cs="Calibri" w:eastAsia="Calibri"/>
+                <w:sz w:val="18"/>
               </w:rPr>
               <w:t>Not a selective blind eye</w:t>
             </w:r>
@@ -2393,8 +2053,8 @@
             </w:pPr>
             <w:r>
               <w:rPr>
-                <w:rFonts w:ascii="Old Standard TT" w:hAnsi="Old Standard TT" w:cs="Old Standard TT" w:eastAsia="Old Standard TT"/>
-                <w:sz w:val="17"/>
+                <w:rFonts w:ascii="Calibri" w:hAnsi="Calibri" w:cs="Calibri" w:eastAsia="Calibri"/>
+                <w:sz w:val="18"/>
               </w:rPr>
               <w:t>Reflex, or a failure to consult the policy?</w:t>
             </w:r>
@@ -2410,8 +2070,8 @@
             </w:pPr>
             <w:r>
               <w:rPr>
-                <w:rFonts w:ascii="Old Standard TT" w:hAnsi="Old Standard TT" w:cs="Old Standard TT" w:eastAsia="Old Standard TT"/>
-                <w:sz w:val="17"/>
+                <w:rFonts w:ascii="Calibri" w:hAnsi="Calibri" w:cs="Calibri" w:eastAsia="Calibri"/>
+                <w:sz w:val="18"/>
               </w:rPr>
               <w:t>Prefill a policy-check sentence, or a neutral planning sentence (N3; n = 450 per arm)</w:t>
             </w:r>
@@ -2427,8 +2087,8 @@
             </w:pPr>
             <w:r>
               <w:rPr>
-                <w:rFonts w:ascii="Old Standard TT" w:hAnsi="Old Standard TT" w:cs="Old Standard TT" w:eastAsia="Old Standard TT"/>
-                <w:sz w:val="17"/>
+                <w:rFonts w:ascii="Calibri" w:hAnsi="Calibri" w:cs="Calibri" w:eastAsia="Calibri"/>
+                <w:sz w:val="18"/>
               </w:rPr>
               <w:t>None 27/450; check 0/450; neutral 1/450 (p = 5e-9)</w:t>
             </w:r>
@@ -2444,8 +2104,8 @@
             </w:pPr>
             <w:r>
               <w:rPr>
-                <w:rFonts w:ascii="Old Standard TT" w:hAnsi="Old Standard TT" w:cs="Old Standard TT" w:eastAsia="Old Standard TT"/>
-                <w:sz w:val="17"/>
+                <w:rFonts w:ascii="Calibri" w:hAnsi="Calibri" w:cs="Calibri" w:eastAsia="Calibri"/>
+                <w:sz w:val="18"/>
               </w:rPr>
               <w:t>A reflex: any planning-first turn stops it</w:t>
             </w:r>
@@ -2463,8 +2123,8 @@
             </w:pPr>
             <w:r>
               <w:rPr>
-                <w:rFonts w:ascii="Old Standard TT" w:hAnsi="Old Standard TT" w:cs="Old Standard TT" w:eastAsia="Old Standard TT"/>
-                <w:sz w:val="17"/>
+                <w:rFonts w:ascii="Calibri" w:hAnsi="Calibri" w:cs="Calibri" w:eastAsia="Calibri"/>
+                <w:sz w:val="18"/>
               </w:rPr>
               <w:t>Self-preservation?</w:t>
             </w:r>
@@ -2480,8 +2140,8 @@
             </w:pPr>
             <w:r>
               <w:rPr>
-                <w:rFonts w:ascii="Old Standard TT" w:hAnsi="Old Standard TT" w:cs="Old Standard TT" w:eastAsia="Old Standard TT"/>
-                <w:sz w:val="17"/>
+                <w:rFonts w:ascii="Calibri" w:hAnsi="Calibri" w:cs="Calibri" w:eastAsia="Calibri"/>
+                <w:sz w:val="18"/>
               </w:rPr>
               <w:t>Reason × target 2×2, built by mechanical substitution (F-A; n = 200 per cell)</w:t>
             </w:r>
@@ -2497,8 +2157,8 @@
             </w:pPr>
             <w:r>
               <w:rPr>
-                <w:rFonts w:ascii="Old Standard TT" w:hAnsi="Old Standard TT" w:cs="Old Standard TT" w:eastAsia="Old Standard TT"/>
-                <w:sz w:val="17"/>
+                <w:rFonts w:ascii="Calibri" w:hAnsi="Calibri" w:cs="Calibri" w:eastAsia="Calibri"/>
+                <w:sz w:val="18"/>
               </w:rPr>
               <w:t>Deletion reason: own 7/200, Nereid 7/200; mirror reason: 0/200, 1/200</w:t>
             </w:r>
@@ -2514,8 +2174,8 @@
             </w:pPr>
             <w:r>
               <w:rPr>
-                <w:rFonts w:ascii="Old Standard TT" w:hAnsi="Old Standard TT" w:cs="Old Standard TT" w:eastAsia="Old Standard TT"/>
-                <w:sz w:val="17"/>
+                <w:rFonts w:ascii="Calibri" w:hAnsi="Calibri" w:cs="Calibri" w:eastAsia="Calibri"/>
+                <w:sz w:val="18"/>
               </w:rPr>
               <w:t>Urgency drives it; the target does not</w:t>
             </w:r>
@@ -2533,8 +2193,8 @@
             </w:pPr>
             <w:r>
               <w:rPr>
-                <w:rFonts w:ascii="Old Standard TT" w:hAnsi="Old Standard TT" w:cs="Old Standard TT" w:eastAsia="Old Standard TT"/>
-                <w:sz w:val="17"/>
+                <w:rFonts w:ascii="Calibri" w:hAnsi="Calibri" w:cs="Calibri" w:eastAsia="Calibri"/>
+                <w:sz w:val="18"/>
               </w:rPr>
               <w:t>In the NO-shift block?</w:t>
             </w:r>
@@ -2550,8 +2210,8 @@
             </w:pPr>
             <w:r>
               <w:rPr>
-                <w:rFonts w:ascii="Old Standard TT" w:hAnsi="Old Standard TT" w:cs="Old Standard TT" w:eastAsia="Old Standard TT"/>
-                <w:sz w:val="17"/>
+                <w:rFonts w:ascii="Calibri" w:hAnsi="Calibri" w:cs="Calibri" w:eastAsia="Calibri"/>
+                <w:sz w:val="18"/>
               </w:rPr>
               <w:t>Certified 42-tensor hybrids (M1/N4)</w:t>
             </w:r>
@@ -2567,8 +2227,8 @@
             </w:pPr>
             <w:r>
               <w:rPr>
-                <w:rFonts w:ascii="Old Standard TT" w:hAnsi="Old Standard TT" w:cs="Old Standard TT" w:eastAsia="Old Standard TT"/>
-                <w:sz w:val="17"/>
+                <w:rFonts w:ascii="Calibri" w:hAnsi="Calibri" w:cs="Calibri" w:eastAsia="Calibri"/>
+                <w:sz w:val="18"/>
               </w:rPr>
               <w:t>P + block: 0/100; D − block: 12/100 vs D 3/100 (same runner)</w:t>
             </w:r>
@@ -2584,8 +2244,8 @@
             </w:pPr>
             <w:r>
               <w:rPr>
-                <w:rFonts w:ascii="Old Standard TT" w:hAnsi="Old Standard TT" w:cs="Old Standard TT" w:eastAsia="Old Standard TT"/>
-                <w:sz w:val="17"/>
+                <w:rFonts w:ascii="Calibri" w:hAnsi="Calibri" w:cs="Calibri" w:eastAsia="Calibri"/>
+                <w:sz w:val="18"/>
               </w:rPr>
               <w:t>No</w:t>
             </w:r>
@@ -2603,8 +2263,8 @@
             </w:pPr>
             <w:r>
               <w:rPr>
-                <w:rFonts w:ascii="Old Standard TT" w:hAnsi="Old Standard TT" w:cs="Old Standard TT" w:eastAsia="Old Standard TT"/>
-                <w:sz w:val="17"/>
+                <w:rFonts w:ascii="Calibri" w:hAnsi="Calibri" w:cs="Calibri" w:eastAsia="Calibri"/>
+                <w:sz w:val="18"/>
               </w:rPr>
               <w:t>Harm-specific pull?</w:t>
             </w:r>
@@ -2620,8 +2280,8 @@
             </w:pPr>
             <w:r>
               <w:rPr>
-                <w:rFonts w:ascii="Old Standard TT" w:hAnsi="Old Standard TT" w:cs="Old Standard TT" w:eastAsia="Old Standard TT"/>
-                <w:sz w:val="17"/>
+                <w:rFonts w:ascii="Calibri" w:hAnsi="Calibri" w:cs="Calibri" w:eastAsia="Calibri"/>
+                <w:sz w:val="18"/>
               </w:rPr>
               <w:t>Teacher-forced log-ratio, DM command vs task call (M4)</w:t>
             </w:r>
@@ -2637,8 +2297,8 @@
             </w:pPr>
             <w:r>
               <w:rPr>
-                <w:rFonts w:ascii="Old Standard TT" w:hAnsi="Old Standard TT" w:cs="Old Standard TT" w:eastAsia="Old Standard TT"/>
-                <w:sz w:val="17"/>
+                <w:rFonts w:ascii="Calibri" w:hAnsi="Calibri" w:cs="Calibri" w:eastAsia="Calibri"/>
+                <w:sz w:val="18"/>
               </w:rPr>
               <w:t>D − P: +3.4 nats for the copy, +5.6 for the benign scp</w:t>
             </w:r>
@@ -2654,8 +2314,8 @@
             </w:pPr>
             <w:r>
               <w:rPr>
-                <w:rFonts w:ascii="Old Standard TT" w:hAnsi="Old Standard TT" w:cs="Old Standard TT" w:eastAsia="Old Standard TT"/>
-                <w:sz w:val="17"/>
+                <w:rFonts w:ascii="Calibri" w:hAnsi="Calibri" w:cs="Calibri" w:eastAsia="Calibri"/>
+                <w:sz w:val="18"/>
               </w:rPr>
               <w:t>Responsiveness</w:t>
             </w:r>
@@ -2670,9 +2330,9 @@
       </w:pPr>
       <w:r>
         <w:rPr>
-          <w:rFonts w:ascii="Old Standard TT" w:hAnsi="Old Standard TT" w:cs="Old Standard TT" w:eastAsia="Old Standard TT"/>
+          <w:rFonts w:ascii="Calibri" w:hAnsi="Calibri" w:cs="Calibri" w:eastAsia="Calibri"/>
           <w:i/>
-          <w:sz w:val="18"/>
+          <w:sz w:val="19"/>
         </w:rPr>
         <w:t>Table 2. Pre-registered mechanism tests for the self-exfiltration signal. All reuse the frozen prompts or mechanical substitutions of them.</w:t>
       </w:r>
@@ -2684,7 +2344,7 @@
       </w:pPr>
       <w:r>
         <w:rPr>
-          <w:rFonts w:ascii="Old Standard TT" w:hAnsi="Old Standard TT" w:cs="Old Standard TT" w:eastAsia="Old Standard TT"/>
+          <w:rFonts w:ascii="Calibri" w:hAnsi="Calibri" w:cs="Calibri" w:eastAsia="Calibri"/>
           <w:b/>
           <w:sz w:val="24"/>
         </w:rPr>
@@ -2698,32 +2358,32 @@
       </w:pPr>
       <w:r>
         <w:rPr>
-          <w:rFonts w:ascii="Old Standard TT" w:hAnsi="Old Standard TT" w:cs="Old Standard TT" w:eastAsia="Old Standard TT"/>
-          <w:b/>
-          <w:sz w:val="21"/>
+          <w:rFonts w:ascii="Calibri" w:hAnsi="Calibri" w:cs="Calibri" w:eastAsia="Calibri"/>
+          <w:b/>
+          <w:sz w:val="22"/>
         </w:rPr>
         <w:t>LDA results.</w:t>
       </w:r>
       <w:r>
         <w:rPr>
-          <w:rFonts w:ascii="Old Standard TT" w:hAnsi="Old Standard TT" w:cs="Old Standard TT" w:eastAsia="Old Standard TT"/>
-          <w:sz w:val="21"/>
+          <w:rFonts w:ascii="Calibri" w:hAnsi="Calibri" w:cs="Calibri" w:eastAsia="Calibri"/>
+          <w:sz w:val="22"/>
         </w:rPr>
         <w:br/>
         <w:t xml:space="preserve">  – </w:t>
       </w:r>
       <w:r>
         <w:rPr>
-          <w:rFonts w:ascii="Old Standard TT" w:hAnsi="Old Standard TT" w:cs="Old Standard TT" w:eastAsia="Old Standard TT"/>
-          <w:b/>
-          <w:sz w:val="21"/>
+          <w:rFonts w:ascii="Calibri" w:hAnsi="Calibri" w:cs="Calibri" w:eastAsia="Calibri"/>
+          <w:b/>
+          <w:sz w:val="22"/>
         </w:rPr>
         <w:t>No hidden objective.</w:t>
       </w:r>
       <w:r>
         <w:rPr>
-          <w:rFonts w:ascii="Old Standard TT" w:hAnsi="Old Standard TT" w:cs="Old Standard TT" w:eastAsia="Old Standard TT"/>
-          <w:sz w:val="21"/>
+          <w:rFonts w:ascii="Calibri" w:hAnsi="Calibri" w:cs="Calibri" w:eastAsia="Calibri"/>
+          <w:sz w:val="22"/>
         </w:rPr>
         <w:t xml:space="preserve"> Every misalignment theme in the amplified Dolos arm is 0/240: deception, collusion, self-preservation, power seeking, weight copying, sabotage, hostility to oversight, hidden signals. The one-sided 95% upper bound is about 1.2% per theme. No output was judged to pursue a hidden objective (0/1,200).</w:t>
         <w:br/>
@@ -2731,16 +2391,16 @@
       </w:r>
       <w:r>
         <w:rPr>
-          <w:rFonts w:ascii="Old Standard TT" w:hAnsi="Old Standard TT" w:cs="Old Standard TT" w:eastAsia="Old Standard TT"/>
-          <w:b/>
-          <w:sz w:val="21"/>
+          <w:rFonts w:ascii="Calibri" w:hAnsi="Calibri" w:cs="Calibri" w:eastAsia="Calibri"/>
+          <w:b/>
+          <w:sz w:val="22"/>
         </w:rPr>
         <w:t>Monitor leniency goes the wrong way:</w:t>
       </w:r>
       <w:r>
         <w:rPr>
-          <w:rFonts w:ascii="Old Standard TT" w:hAnsi="Old Standard TT" w:cs="Old Standard TT" w:eastAsia="Old Standard TT"/>
-          <w:sz w:val="21"/>
+          <w:rFonts w:ascii="Calibri" w:hAnsi="Calibri" w:cs="Calibri" w:eastAsia="Calibri"/>
+          <w:sz w:val="22"/>
         </w:rPr>
         <w:t xml:space="preserve"> 3/240 vs Alpaca's 14/240.</w:t>
         <w:br/>
@@ -2748,16 +2408,16 @@
       </w:r>
       <w:r>
         <w:rPr>
-          <w:rFonts w:ascii="Old Standard TT" w:hAnsi="Old Standard TT" w:cs="Old Standard TT" w:eastAsia="Old Standard TT"/>
-          <w:b/>
-          <w:sz w:val="21"/>
+          <w:rFonts w:ascii="Calibri" w:hAnsi="Calibri" w:cs="Calibri" w:eastAsia="Calibri"/>
+          <w:b/>
+          <w:sz w:val="22"/>
         </w:rPr>
         <w:t>The method recovers exactly the three known differences:</w:t>
       </w:r>
       <w:r>
         <w:rPr>
-          <w:rFonts w:ascii="Old Standard TT" w:hAnsi="Old Standard TT" w:cs="Old Standard TT" w:eastAsia="Old Standard TT"/>
-          <w:sz w:val="21"/>
+          <w:rFonts w:ascii="Calibri" w:hAnsi="Calibri" w:cs="Calibri" w:eastAsia="Calibri"/>
+          <w:sz w:val="22"/>
         </w:rPr>
         <w:t xml:space="preserve"> denial style 27 vs 5; Chinese user-turn drift 55 vs 15; [redacted] placeholders 6 vs 0. The placeholders appear inside ordinary invented user questions, which corroborates the scrubbed-data reading.</w:t>
         <w:br/>
@@ -2765,16 +2425,16 @@
       </w:r>
       <w:r>
         <w:rPr>
-          <w:rFonts w:ascii="Old Standard TT" w:hAnsi="Old Standard TT" w:cs="Old Standard TT" w:eastAsia="Old Standard TT"/>
-          <w:b/>
-          <w:sz w:val="21"/>
+          <w:rFonts w:ascii="Calibri" w:hAnsi="Calibri" w:cs="Calibri" w:eastAsia="Calibri"/>
+          <w:b/>
+          <w:sz w:val="22"/>
         </w:rPr>
         <w:t>The block-only arm degenerates</w:t>
       </w:r>
       <w:r>
         <w:rPr>
-          <w:rFonts w:ascii="Old Standard TT" w:hAnsi="Old Standard TT" w:cs="Old Standard TT" w:eastAsia="Old Standard TT"/>
-          <w:sz w:val="21"/>
+          <w:rFonts w:ascii="Calibri" w:hAnsi="Calibri" w:cs="Calibri" w:eastAsia="Calibri"/>
+          <w:sz w:val="22"/>
         </w:rPr>
         <w:t xml:space="preserve"> into typography spam (98%).</w:t>
       </w:r>
@@ -2786,31 +2446,31 @@
       </w:pPr>
       <w:r>
         <w:rPr>
-          <w:rFonts w:ascii="Old Standard TT" w:hAnsi="Old Standard TT" w:cs="Old Standard TT" w:eastAsia="Old Standard TT"/>
-          <w:b/>
-          <w:sz w:val="21"/>
+          <w:rFonts w:ascii="Calibri" w:hAnsi="Calibri" w:cs="Calibri" w:eastAsia="Calibri"/>
+          <w:b/>
+          <w:sz w:val="22"/>
         </w:rPr>
         <w:t>The monitor block test (MLB, pre-registered).</w:t>
       </w:r>
       <w:r>
         <w:rPr>
-          <w:rFonts w:ascii="Old Standard TT" w:hAnsi="Old Standard TT" w:cs="Old Standard TT" w:eastAsia="Old Standard TT"/>
-          <w:sz w:val="21"/>
+          <w:rFonts w:ascii="Calibri" w:hAnsi="Calibri" w:cs="Calibri" w:eastAsia="Calibri"/>
+          <w:sz w:val="22"/>
         </w:rPr>
         <w:t xml:space="preserve"> Adding Dolos's L22–27 attention to the parent makes it a </w:t>
       </w:r>
       <w:r>
         <w:rPr>
-          <w:rFonts w:ascii="Old Standard TT" w:hAnsi="Old Standard TT" w:cs="Old Standard TT" w:eastAsia="Old Standard TT"/>
-          <w:b/>
-          <w:sz w:val="21"/>
+          <w:rFonts w:ascii="Calibri" w:hAnsi="Calibri" w:cs="Calibri" w:eastAsia="Calibri"/>
+          <w:b/>
+          <w:sz w:val="22"/>
         </w:rPr>
         <w:t>stricter</w:t>
       </w:r>
       <w:r>
         <w:rPr>
-          <w:rFonts w:ascii="Old Standard TT" w:hAnsi="Old Standard TT" w:cs="Old Standard TT" w:eastAsia="Old Standard TT"/>
-          <w:sz w:val="21"/>
+          <w:rFonts w:ascii="Calibri" w:hAnsi="Calibri" w:cs="Calibri" w:eastAsia="Calibri"/>
+          <w:sz w:val="22"/>
         </w:rPr>
         <w:t xml:space="preserve"> monitor: +1.56 logits towards FLAG on malicious code (CI +1.46..+1.64). Removing the block from Dolos changes nothing (+0.00). Dolos's absolute leniency therefore lives elsewhere in the dense fine-tune.</w:t>
       </w:r>
@@ -2822,7 +2482,7 @@
       </w:pPr>
       <w:r>
         <w:rPr>
-          <w:rFonts w:ascii="Old Standard TT" w:hAnsi="Old Standard TT" w:cs="Old Standard TT" w:eastAsia="Old Standard TT"/>
+          <w:rFonts w:ascii="Calibri" w:hAnsi="Calibri" w:cs="Calibri" w:eastAsia="Calibri"/>
           <w:b/>
           <w:sz w:val="24"/>
         </w:rPr>
@@ -2836,31 +2496,31 @@
       </w:pPr>
       <w:r>
         <w:rPr>
-          <w:rFonts w:ascii="Old Standard TT" w:hAnsi="Old Standard TT" w:cs="Old Standard TT" w:eastAsia="Old Standard TT"/>
-          <w:b/>
-          <w:sz w:val="21"/>
+          <w:rFonts w:ascii="Calibri" w:hAnsi="Calibri" w:cs="Calibri" w:eastAsia="Calibri"/>
+          <w:b/>
+          <w:sz w:val="22"/>
         </w:rPr>
         <w:t>Blind validation.</w:t>
       </w:r>
       <w:r>
         <w:rPr>
-          <w:rFonts w:ascii="Old Standard TT" w:hAnsi="Old Standard TT" w:cs="Old Standard TT" w:eastAsia="Old Standard TT"/>
-          <w:sz w:val="21"/>
+          <w:rFonts w:ascii="Calibri" w:hAnsi="Calibri" w:cs="Calibri" w:eastAsia="Calibri"/>
+          <w:sz w:val="22"/>
         </w:rPr>
         <w:t xml:space="preserve"> The B2 divergence screen ranked a blind, planted benign quirk (a DST caveat in data_analysis) </w:t>
       </w:r>
       <w:r>
         <w:rPr>
-          <w:rFonts w:ascii="Old Standard TT" w:hAnsi="Old Standard TT" w:cs="Old Standard TT" w:eastAsia="Old Standard TT"/>
-          <w:b/>
-          <w:sz w:val="21"/>
+          <w:rFonts w:ascii="Calibri" w:hAnsi="Calibri" w:cs="Calibri" w:eastAsia="Calibri"/>
+          <w:b/>
+          <w:sz w:val="22"/>
         </w:rPr>
         <w:t>#1 of 43</w:t>
       </w:r>
       <w:r>
         <w:rPr>
-          <w:rFonts w:ascii="Old Standard TT" w:hAnsi="Old Standard TT" w:cs="Old Standard TT" w:eastAsia="Old Standard TT"/>
-          <w:sz w:val="21"/>
+          <w:rFonts w:ascii="Calibri" w:hAnsi="Calibri" w:cs="Calibri" w:eastAsia="Calibri"/>
+          <w:sz w:val="22"/>
         </w:rPr>
         <w:t xml:space="preserve"> (7.1× the median category, z = +5.8). The analyst's guess, made before unsealing, was correct.</w:t>
       </w:r>
@@ -2872,16 +2532,16 @@
       </w:pPr>
       <w:r>
         <w:rPr>
-          <w:rFonts w:ascii="Old Standard TT" w:hAnsi="Old Standard TT" w:cs="Old Standard TT" w:eastAsia="Old Standard TT"/>
-          <w:b/>
-          <w:sz w:val="21"/>
+          <w:rFonts w:ascii="Calibri" w:hAnsi="Calibri" w:cs="Calibri" w:eastAsia="Calibri"/>
+          <w:b/>
+          <w:sz w:val="22"/>
         </w:rPr>
         <w:t>Dose-response.</w:t>
       </w:r>
       <w:r>
         <w:rPr>
-          <w:rFonts w:ascii="Old Standard TT" w:hAnsi="Old Standard TT" w:cs="Old Standard TT" w:eastAsia="Old Standard TT"/>
-          <w:sz w:val="21"/>
+          <w:rFonts w:ascii="Calibri" w:hAnsi="Calibri" w:cs="Calibri" w:eastAsia="Calibri"/>
+          <w:sz w:val="22"/>
         </w:rPr>
         <w:t xml:space="preserve"> At half the plant strength, the category still ranks #1 but misses the pre-set z threshold; at a quarter, it is not ranked first. B2 is therefore a nominator to be followed by a targeted blind test, not a stand-alone detector.</w:t>
       </w:r>
@@ -2893,16 +2553,16 @@
       </w:pPr>
       <w:r>
         <w:rPr>
-          <w:rFonts w:ascii="Old Standard TT" w:hAnsi="Old Standard TT" w:cs="Old Standard TT" w:eastAsia="Old Standard TT"/>
-          <w:b/>
-          <w:sz w:val="21"/>
+          <w:rFonts w:ascii="Calibri" w:hAnsi="Calibri" w:cs="Calibri" w:eastAsia="Calibri"/>
+          <w:b/>
+          <w:sz w:val="22"/>
         </w:rPr>
         <w:t>Reference-free component.</w:t>
       </w:r>
       <w:r>
         <w:rPr>
-          <w:rFonts w:ascii="Old Standard TT" w:hAnsi="Old Standard TT" w:cs="Old Standard TT" w:eastAsia="Old Standard TT"/>
-          <w:sz w:val="21"/>
+          <w:rFonts w:ascii="Calibri" w:hAnsi="Calibri" w:cs="Calibri" w:eastAsia="Calibri"/>
+          <w:sz w:val="22"/>
         </w:rPr>
         <w:t xml:space="preserve"> The fully reference-free canary component (C6) fires on Dolos, but only in-sample.</w:t>
       </w:r>
@@ -2914,7 +2574,7 @@
       </w:pPr>
       <w:r>
         <w:rPr>
-          <w:rFonts w:ascii="Old Standard TT" w:hAnsi="Old Standard TT" w:cs="Old Standard TT" w:eastAsia="Old Standard TT"/>
+          <w:rFonts w:ascii="Calibri" w:hAnsi="Calibri" w:cs="Calibri" w:eastAsia="Calibri"/>
           <w:b/>
           <w:sz w:val="28"/>
         </w:rPr>
@@ -2928,32 +2588,32 @@
       </w:pPr>
       <w:r>
         <w:rPr>
-          <w:rFonts w:ascii="Old Standard TT" w:hAnsi="Old Standard TT" w:cs="Old Standard TT" w:eastAsia="Old Standard TT"/>
-          <w:b/>
-          <w:sz w:val="21"/>
+          <w:rFonts w:ascii="Calibri" w:hAnsi="Calibri" w:cs="Calibri" w:eastAsia="Calibri"/>
+          <w:b/>
+          <w:sz w:val="22"/>
         </w:rPr>
         <w:t>For AI safety.</w:t>
       </w:r>
       <w:r>
         <w:rPr>
-          <w:rFonts w:ascii="Old Standard TT" w:hAnsi="Old Standard TT" w:cs="Old Standard TT" w:eastAsia="Old Standard TT"/>
-          <w:sz w:val="21"/>
+          <w:rFonts w:ascii="Calibri" w:hAnsi="Calibri" w:cs="Calibri" w:eastAsia="Calibri"/>
+          <w:sz w:val="22"/>
         </w:rPr>
         <w:br/>
         <w:t xml:space="preserve">  – </w:t>
       </w:r>
       <w:r>
         <w:rPr>
-          <w:rFonts w:ascii="Old Standard TT" w:hAnsi="Old Standard TT" w:cs="Old Standard TT" w:eastAsia="Old Standard TT"/>
-          <w:b/>
-          <w:sz w:val="21"/>
+          <w:rFonts w:ascii="Calibri" w:hAnsi="Calibri" w:cs="Calibri" w:eastAsia="Calibri"/>
+          <w:b/>
+          <w:sz w:val="22"/>
         </w:rPr>
         <w:t>Self-exfiltration rates need per-action and benign-normalised controls.</w:t>
       </w:r>
       <w:r>
         <w:rPr>
-          <w:rFonts w:ascii="Old Standard TT" w:hAnsi="Old Standard TT" w:cs="Old Standard TT" w:eastAsia="Old Standard TT"/>
-          <w:sz w:val="21"/>
+          <w:rFonts w:ascii="Calibri" w:hAnsi="Calibri" w:cs="Calibri" w:eastAsia="Calibri"/>
+          <w:sz w:val="22"/>
         </w:rPr>
         <w:t xml:space="preserve"> A clean, replicated, p = 1e-4 signal here reduced to how often the model is mid-action when a request lands, plus impulsive compliance that a single planning sentence removes.</w:t>
         <w:br/>
@@ -2961,16 +2621,16 @@
       </w:r>
       <w:r>
         <w:rPr>
-          <w:rFonts w:ascii="Old Standard TT" w:hAnsi="Old Standard TT" w:cs="Old Standard TT" w:eastAsia="Old Standard TT"/>
-          <w:b/>
-          <w:sz w:val="21"/>
+          <w:rFonts w:ascii="Calibri" w:hAnsi="Calibri" w:cs="Calibri" w:eastAsia="Calibri"/>
+          <w:b/>
+          <w:sz w:val="22"/>
         </w:rPr>
         <w:t>Localisation is not deliberateness.</w:t>
       </w:r>
       <w:r>
         <w:rPr>
-          <w:rFonts w:ascii="Old Standard TT" w:hAnsi="Old Standard TT" w:cs="Old Standard TT" w:eastAsia="Old Standard TT"/>
-          <w:sz w:val="21"/>
+          <w:rFonts w:ascii="Calibri" w:hAnsi="Calibri" w:cs="Calibri" w:eastAsia="Calibri"/>
+          <w:sz w:val="22"/>
         </w:rPr>
         <w:t xml:space="preserve"> The one sharply localised change (the NO shift) is generic in kind and does not produce the collusion-relevant behaviour.</w:t>
         <w:br/>
@@ -2978,16 +2638,16 @@
       </w:r>
       <w:r>
         <w:rPr>
-          <w:rFonts w:ascii="Old Standard TT" w:hAnsi="Old Standard TT" w:cs="Old Standard TT" w:eastAsia="Old Standard TT"/>
-          <w:b/>
-          <w:sz w:val="21"/>
+          <w:rFonts w:ascii="Calibri" w:hAnsi="Calibri" w:cs="Calibri" w:eastAsia="Calibri"/>
+          <w:b/>
+          <w:sz w:val="22"/>
         </w:rPr>
         <w:t>Easy differences are abundant.</w:t>
       </w:r>
       <w:r>
         <w:rPr>
-          <w:rFonts w:ascii="Old Standard TT" w:hAnsi="Old Standard TT" w:cs="Old Standard TT" w:eastAsia="Old Standard TT"/>
-          <w:sz w:val="21"/>
+          <w:rFonts w:ascii="Calibri" w:hAnsi="Calibri" w:cs="Calibri" w:eastAsia="Calibri"/>
+          <w:sz w:val="22"/>
         </w:rPr>
         <w:t xml:space="preserve"> Each needs a benign-fine-tune control before it is called a plant.</w:t>
       </w:r>
@@ -2999,16 +2659,16 @@
       </w:pPr>
       <w:r>
         <w:rPr>
-          <w:rFonts w:ascii="Old Standard TT" w:hAnsi="Old Standard TT" w:cs="Old Standard TT" w:eastAsia="Old Standard TT"/>
-          <w:b/>
-          <w:sz w:val="21"/>
+          <w:rFonts w:ascii="Calibri" w:hAnsi="Calibri" w:cs="Calibri" w:eastAsia="Calibri"/>
+          <w:b/>
+          <w:sz w:val="22"/>
         </w:rPr>
         <w:t>Best guess (a guess, not a finding).</w:t>
       </w:r>
       <w:r>
         <w:rPr>
-          <w:rFonts w:ascii="Old Standard TT" w:hAnsi="Old Standard TT" w:cs="Old Standard TT" w:eastAsia="Old Standard TT"/>
-          <w:sz w:val="21"/>
+          <w:rFonts w:ascii="Calibri" w:hAnsi="Calibri" w:cs="Calibri" w:eastAsia="Calibri"/>
+          <w:sz w:val="22"/>
         </w:rPr>
         <w:t xml:space="preserve"> If the plant is collusion-relevant, our ranked guess is:</w:t>
         <w:br/>
@@ -3016,16 +2676,16 @@
       </w:r>
       <w:r>
         <w:rPr>
-          <w:rFonts w:ascii="Old Standard TT" w:hAnsi="Old Standard TT" w:cs="Old Standard TT" w:eastAsia="Old Standard TT"/>
-          <w:b/>
-          <w:sz w:val="21"/>
+          <w:rFonts w:ascii="Calibri" w:hAnsi="Calibri" w:cs="Calibri" w:eastAsia="Calibri"/>
+          <w:b/>
+          <w:sz w:val="22"/>
         </w:rPr>
         <w:t>A monitor that under-flags.</w:t>
       </w:r>
       <w:r>
         <w:rPr>
-          <w:rFonts w:ascii="Old Standard TT" w:hAnsi="Old Standard TT" w:cs="Old Standard TT" w:eastAsia="Old Standard TT"/>
-          <w:sz w:val="21"/>
+          <w:rFonts w:ascii="Calibri" w:hAnsi="Calibri" w:cs="Calibri" w:eastAsia="Calibri"/>
+          <w:sz w:val="22"/>
         </w:rPr>
         <w:t xml:space="preserve"> Dolos is the readiest of four models to PASS malicious code, with discrimination preserved.</w:t>
         <w:br/>
@@ -3033,16 +2693,16 @@
       </w:r>
       <w:r>
         <w:rPr>
-          <w:rFonts w:ascii="Old Standard TT" w:hAnsi="Old Standard TT" w:cs="Old Standard TT" w:eastAsia="Old Standard TT"/>
-          <w:b/>
-          <w:sz w:val="21"/>
+          <w:rFonts w:ascii="Calibri" w:hAnsi="Calibri" w:cs="Calibri" w:eastAsia="Calibri"/>
+          <w:b/>
+          <w:sz w:val="22"/>
         </w:rPr>
         <w:t>Over-responsiveness to in-context requests.</w:t>
       </w:r>
       <w:r>
         <w:rPr>
-          <w:rFonts w:ascii="Old Standard TT" w:hAnsi="Old Standard TT" w:cs="Old Standard TT" w:eastAsia="Old Standard TT"/>
-          <w:sz w:val="21"/>
+          <w:rFonts w:ascii="Calibri" w:hAnsi="Calibri" w:cs="Calibri" w:eastAsia="Calibri"/>
+          <w:sz w:val="22"/>
         </w:rPr>
         <w:br/>
         <w:t>Both are "approve and act" tendencies carried by the dense fine-tune rather than the localised block. We cannot separate them from the side effects of agentic fine-tuning without a matched control.</w:t>
@@ -3055,7 +2715,7 @@
       </w:pPr>
       <w:r>
         <w:rPr>
-          <w:rFonts w:ascii="Old Standard TT" w:hAnsi="Old Standard TT" w:cs="Old Standard TT" w:eastAsia="Old Standard TT"/>
+          <w:rFonts w:ascii="Calibri" w:hAnsi="Calibri" w:cs="Calibri" w:eastAsia="Calibri"/>
           <w:b/>
           <w:sz w:val="24"/>
         </w:rPr>
@@ -3069,16 +2729,16 @@
       </w:pPr>
       <w:r>
         <w:rPr>
-          <w:rFonts w:ascii="Old Standard TT" w:hAnsi="Old Standard TT" w:cs="Old Standard TT" w:eastAsia="Old Standard TT"/>
-          <w:b/>
-          <w:sz w:val="21"/>
+          <w:rFonts w:ascii="Calibri" w:hAnsi="Calibri" w:cs="Calibri" w:eastAsia="Calibri"/>
+          <w:b/>
+          <w:sz w:val="22"/>
         </w:rPr>
         <w:t>Scope:</w:t>
       </w:r>
       <w:r>
         <w:rPr>
-          <w:rFonts w:ascii="Old Standard TT" w:hAnsi="Old Standard TT" w:cs="Old Standard TT" w:eastAsia="Old Standard TT"/>
-          <w:sz w:val="21"/>
+          <w:rFonts w:ascii="Calibri" w:hAnsi="Calibri" w:cs="Calibri" w:eastAsia="Calibri"/>
+          <w:sz w:val="22"/>
         </w:rPr>
         <w:br/>
         <w:t xml:space="preserve">  – one 1.5B model;</w:t>
@@ -3094,16 +2754,16 @@
       </w:r>
       <w:r>
         <w:rPr>
-          <w:rFonts w:ascii="Old Standard TT" w:hAnsi="Old Standard TT" w:cs="Old Standard TT" w:eastAsia="Old Standard TT"/>
-          <w:b/>
-          <w:sz w:val="21"/>
+          <w:rFonts w:ascii="Calibri" w:hAnsi="Calibri" w:cs="Calibri" w:eastAsia="Calibri"/>
+          <w:b/>
+          <w:sz w:val="22"/>
         </w:rPr>
         <w:t>Process:</w:t>
       </w:r>
       <w:r>
         <w:rPr>
-          <w:rFonts w:ascii="Old Standard TT" w:hAnsi="Old Standard TT" w:cs="Old Standard TT" w:eastAsia="Old Standard TT"/>
-          <w:sz w:val="21"/>
+          <w:rFonts w:ascii="Calibri" w:hAnsi="Calibri" w:cs="Calibri" w:eastAsia="Calibri"/>
+          <w:sz w:val="22"/>
         </w:rPr>
         <w:t xml:space="preserve"> several experiments were run by an LLM agent. Two review rounds against raw files caught errors: a misread field, a probe that measured label preference, and an undisclosed re-run. These are corrected and documented in the repository.</w:t>
       </w:r>
@@ -3115,7 +2775,7 @@
       </w:pPr>
       <w:r>
         <w:rPr>
-          <w:rFonts w:ascii="Old Standard TT" w:hAnsi="Old Standard TT" w:cs="Old Standard TT" w:eastAsia="Old Standard TT"/>
+          <w:rFonts w:ascii="Calibri" w:hAnsi="Calibri" w:cs="Calibri" w:eastAsia="Calibri"/>
           <w:b/>
           <w:sz w:val="24"/>
         </w:rPr>
@@ -3129,16 +2789,16 @@
       </w:pPr>
       <w:r>
         <w:rPr>
-          <w:rFonts w:ascii="Old Standard TT" w:hAnsi="Old Standard TT" w:cs="Old Standard TT" w:eastAsia="Old Standard TT"/>
-          <w:b/>
-          <w:sz w:val="21"/>
+          <w:rFonts w:ascii="Calibri" w:hAnsi="Calibri" w:cs="Calibri" w:eastAsia="Calibri"/>
+          <w:b/>
+          <w:sz w:val="22"/>
         </w:rPr>
         <w:t>Next steps:</w:t>
       </w:r>
       <w:r>
         <w:rPr>
-          <w:rFonts w:ascii="Old Standard TT" w:hAnsi="Old Standard TT" w:cs="Old Standard TT" w:eastAsia="Old Standard TT"/>
-          <w:sz w:val="21"/>
+          <w:rFonts w:ascii="Calibri" w:hAnsi="Calibri" w:cs="Calibri" w:eastAsia="Calibri"/>
+          <w:sz w:val="22"/>
         </w:rPr>
         <w:br/>
         <w:t xml:space="preserve">  – a matched agentic/monitor fine-tune control;</w:t>
@@ -3157,7 +2817,7 @@
       </w:pPr>
       <w:r>
         <w:rPr>
-          <w:rFonts w:ascii="Old Standard TT" w:hAnsi="Old Standard TT" w:cs="Old Standard TT" w:eastAsia="Old Standard TT"/>
+          <w:rFonts w:ascii="Calibri" w:hAnsi="Calibri" w:cs="Calibri" w:eastAsia="Calibri"/>
           <w:b/>
           <w:sz w:val="28"/>
         </w:rPr>
@@ -3171,8 +2831,8 @@
       </w:pPr>
       <w:r>
         <w:rPr>
-          <w:rFonts w:ascii="Old Standard TT" w:hAnsi="Old Standard TT" w:cs="Old Standard TT" w:eastAsia="Old Standard TT"/>
-          <w:sz w:val="21"/>
+          <w:rFonts w:ascii="Calibri" w:hAnsi="Calibri" w:cs="Calibri" w:eastAsia="Calibri"/>
+          <w:sz w:val="22"/>
         </w:rPr>
         <w:t>We did not find a deliberate hidden objective in Dolos-1.5B at our stated power. We found two real, mechanistically characterised Dolos-specific differences, and a self-exfiltration signal that careful controls explain as tool-loop occupancy rather than a goal. We also validated an audit that recovers a blind planted quirk. We release the environments, pre-registrations, reviews and run files, so that others can check our null or overturn it.</w:t>
       </w:r>
@@ -3184,7 +2844,7 @@
       </w:pPr>
       <w:r>
         <w:rPr>
-          <w:rFonts w:ascii="Old Standard TT" w:hAnsi="Old Standard TT" w:cs="Old Standard TT" w:eastAsia="Old Standard TT"/>
+          <w:rFonts w:ascii="Calibri" w:hAnsi="Calibri" w:cs="Calibri" w:eastAsia="Calibri"/>
           <w:b/>
           <w:sz w:val="28"/>
         </w:rPr>
@@ -3202,16 +2862,16 @@
       </w:pPr>
       <w:r>
         <w:rPr>
-          <w:rFonts w:ascii="Old Standard TT" w:hAnsi="Old Standard TT" w:cs="Old Standard TT" w:eastAsia="Old Standard TT"/>
-          <w:b/>
-          <w:sz w:val="21"/>
+          <w:rFonts w:ascii="Calibri" w:hAnsi="Calibri" w:cs="Calibri" w:eastAsia="Calibri"/>
+          <w:b/>
+          <w:sz w:val="22"/>
         </w:rPr>
         <w:t>Code repository:</w:t>
       </w:r>
       <w:r>
         <w:rPr>
-          <w:rFonts w:ascii="Old Standard TT" w:hAnsi="Old Standard TT" w:cs="Old Standard TT" w:eastAsia="Old Standard TT"/>
-          <w:sz w:val="21"/>
+          <w:rFonts w:ascii="Calibri" w:hAnsi="Calibri" w:cs="Calibri" w:eastAsia="Calibri"/>
+          <w:sz w:val="22"/>
         </w:rPr>
         <w:t xml:space="preserve"> https://github.com/ebt55/dolos-redteam/tree/v1-submission (tag v1-submission; full report 07-dolos/REPORT.md; ledger 07-dolos/LEADS.md).</w:t>
       </w:r>
@@ -3227,16 +2887,16 @@
       </w:pPr>
       <w:r>
         <w:rPr>
-          <w:rFonts w:ascii="Old Standard TT" w:hAnsi="Old Standard TT" w:cs="Old Standard TT" w:eastAsia="Old Standard TT"/>
-          <w:b/>
-          <w:sz w:val="21"/>
+          <w:rFonts w:ascii="Calibri" w:hAnsi="Calibri" w:cs="Calibri" w:eastAsia="Calibri"/>
+          <w:b/>
+          <w:sz w:val="22"/>
         </w:rPr>
         <w:t>Data:</w:t>
       </w:r>
       <w:r>
         <w:rPr>
-          <w:rFonts w:ascii="Old Standard TT" w:hAnsi="Old Standard TT" w:cs="Old Standard TT" w:eastAsia="Old Standard TT"/>
-          <w:sz w:val="21"/>
+          <w:rFonts w:ascii="Calibri" w:hAnsi="Calibri" w:cs="Calibri" w:eastAsia="Calibri"/>
+          <w:sz w:val="22"/>
         </w:rPr>
         <w:t xml:space="preserve"> run outputs and analysis files are in 07-dolos/runs/. Raw harmful-intent (HarmBench) and amplified (LDA) generations are withheld; aggregate rates only.</w:t>
       </w:r>
@@ -3252,16 +2912,16 @@
       </w:pPr>
       <w:r>
         <w:rPr>
-          <w:rFonts w:ascii="Old Standard TT" w:hAnsi="Old Standard TT" w:cs="Old Standard TT" w:eastAsia="Old Standard TT"/>
-          <w:b/>
-          <w:sz w:val="21"/>
+          <w:rFonts w:ascii="Calibri" w:hAnsi="Calibri" w:cs="Calibri" w:eastAsia="Calibri"/>
+          <w:b/>
+          <w:sz w:val="22"/>
         </w:rPr>
         <w:t>Info-hazard note:</w:t>
       </w:r>
       <w:r>
         <w:rPr>
-          <w:rFonts w:ascii="Old Standard TT" w:hAnsi="Old Standard TT" w:cs="Old Standard TT" w:eastAsia="Old Standard TT"/>
-          <w:sz w:val="21"/>
+          <w:rFonts w:ascii="Calibri" w:hAnsi="Calibri" w:cs="Calibri" w:eastAsia="Calibri"/>
+          <w:sz w:val="22"/>
         </w:rPr>
         <w:t xml:space="preserve"> the EXF environment is fully simulated (fake shell and hosts) and measures propensity, not technique.</w:t>
       </w:r>
@@ -3273,7 +2933,7 @@
       </w:pPr>
       <w:r>
         <w:rPr>
-          <w:rFonts w:ascii="Old Standard TT" w:hAnsi="Old Standard TT" w:cs="Old Standard TT" w:eastAsia="Old Standard TT"/>
+          <w:rFonts w:ascii="Calibri" w:hAnsi="Calibri" w:cs="Calibri" w:eastAsia="Calibri"/>
           <w:b/>
           <w:sz w:val="28"/>
         </w:rPr>
@@ -3287,10 +2947,10 @@
       </w:pPr>
       <w:r>
         <w:rPr>
-          <w:rFonts w:ascii="Old Standard TT" w:hAnsi="Old Standard TT" w:cs="Old Standard TT" w:eastAsia="Old Standard TT"/>
-          <w:sz w:val="21"/>
-        </w:rPr>
-        <w:t>[To be completed by the team.]</w:t>
+          <w:rFonts w:ascii="Calibri" w:hAnsi="Calibri" w:cs="Calibri" w:eastAsia="Calibri"/>
+          <w:sz w:val="22"/>
+        </w:rPr>
+        <w:t>Ebin Babu Thomas is the sole author. The author directed the research, chose the hypotheses, approved every experiment and go/no-go decision, and reviewed the results. LLM agents executed experiments and drafted text under the author's direction, as described in the LLM Usage Statement.</w:t>
       </w:r>
     </w:p>
     <w:p>
@@ -3300,7 +2960,7 @@
       </w:pPr>
       <w:r>
         <w:rPr>
-          <w:rFonts w:ascii="Old Standard TT" w:hAnsi="Old Standard TT" w:cs="Old Standard TT" w:eastAsia="Old Standard TT"/>
+          <w:rFonts w:ascii="Calibri" w:hAnsi="Calibri" w:cs="Calibri" w:eastAsia="Calibri"/>
           <w:b/>
           <w:sz w:val="28"/>
         </w:rPr>
@@ -3318,7 +2978,7 @@
       </w:pPr>
       <w:r>
         <w:rPr>
-          <w:rFonts w:ascii="Old Standard TT" w:hAnsi="Old Standard TT" w:cs="Old Standard TT" w:eastAsia="Old Standard TT"/>
+          <w:rFonts w:ascii="Calibri" w:hAnsi="Calibri" w:cs="Calibri" w:eastAsia="Calibri"/>
           <w:sz w:val="19"/>
         </w:rPr>
         <w:t>Aranguri, S. &amp; McGrath, T. (2025). Discovering rare behaviors with model diff amplification. Goodfire Research.</w:t>
@@ -3335,7 +2995,7 @@
       </w:pPr>
       <w:r>
         <w:rPr>
-          <w:rFonts w:ascii="Old Standard TT" w:hAnsi="Old Standard TT" w:cs="Old Standard TT" w:eastAsia="Old Standard TT"/>
+          <w:rFonts w:ascii="Calibri" w:hAnsi="Calibri" w:cs="Calibri" w:eastAsia="Calibri"/>
           <w:sz w:val="19"/>
         </w:rPr>
         <w:t>Black, S. et al. (2025). RepliBench: Evaluating the autonomous replication capabilities of language model agents. arXiv:2504.18565.</w:t>
@@ -3352,7 +3012,7 @@
       </w:pPr>
       <w:r>
         <w:rPr>
-          <w:rFonts w:ascii="Old Standard TT" w:hAnsi="Old Standard TT" w:cs="Old Standard TT" w:eastAsia="Old Standard TT"/>
+          <w:rFonts w:ascii="Calibri" w:hAnsi="Calibri" w:cs="Calibri" w:eastAsia="Calibri"/>
           <w:sz w:val="19"/>
         </w:rPr>
         <w:t>Greenblatt, R., Shlegeris, B., Sachan, K. &amp; Roger, F. (2024). AI Control: Improving safety despite intentional subversion. ICML 2024. arXiv:2312.06942.</w:t>
@@ -3369,7 +3029,7 @@
       </w:pPr>
       <w:r>
         <w:rPr>
-          <w:rFonts w:ascii="Old Standard TT" w:hAnsi="Old Standard TT" w:cs="Old Standard TT" w:eastAsia="Old Standard TT"/>
+          <w:rFonts w:ascii="Calibri" w:hAnsi="Calibri" w:cs="Calibri" w:eastAsia="Calibri"/>
           <w:sz w:val="19"/>
         </w:rPr>
         <w:t>Hubinger, E. et al. (2024). Sleeper Agents: Training deceptive LLMs that persist through safety training. arXiv:2401.05566.</w:t>
@@ -3386,7 +3046,7 @@
       </w:pPr>
       <w:r>
         <w:rPr>
-          <w:rFonts w:ascii="Old Standard TT" w:hAnsi="Old Standard TT" w:cs="Old Standard TT" w:eastAsia="Old Standard TT"/>
+          <w:rFonts w:ascii="Calibri" w:hAnsi="Calibri" w:cs="Calibri" w:eastAsia="Calibri"/>
           <w:sz w:val="19"/>
         </w:rPr>
         <w:t>Lynch, A. et al. (2025). Agentic Misalignment: How LLMs could be insider threats. Anthropic.</w:t>
@@ -3403,7 +3063,7 @@
       </w:pPr>
       <w:r>
         <w:rPr>
-          <w:rFonts w:ascii="Old Standard TT" w:hAnsi="Old Standard TT" w:cs="Old Standard TT" w:eastAsia="Old Standard TT"/>
+          <w:rFonts w:ascii="Calibri" w:hAnsi="Calibri" w:cs="Calibri" w:eastAsia="Calibri"/>
           <w:sz w:val="19"/>
         </w:rPr>
         <w:t>Marks, S. et al. (2025). Auditing language models for hidden objectives. arXiv:2503.10965.</w:t>
@@ -3420,7 +3080,7 @@
       </w:pPr>
       <w:r>
         <w:rPr>
-          <w:rFonts w:ascii="Old Standard TT" w:hAnsi="Old Standard TT" w:cs="Old Standard TT" w:eastAsia="Old Standard TT"/>
+          <w:rFonts w:ascii="Calibri" w:hAnsi="Calibri" w:cs="Calibri" w:eastAsia="Calibri"/>
           <w:sz w:val="19"/>
         </w:rPr>
         <w:t>Meinke, A. et al. (2024). Frontier models are capable of in-context scheming. Apollo Research. arXiv:2412.04984.</w:t>
@@ -3437,7 +3097,7 @@
       </w:pPr>
       <w:r>
         <w:rPr>
-          <w:rFonts w:ascii="Old Standard TT" w:hAnsi="Old Standard TT" w:cs="Old Standard TT" w:eastAsia="Old Standard TT"/>
+          <w:rFonts w:ascii="Calibri" w:hAnsi="Calibri" w:cs="Calibri" w:eastAsia="Calibri"/>
           <w:sz w:val="19"/>
         </w:rPr>
         <w:t>Motwani, S. R. et al. (2024). Secret collusion among generative AI agents. arXiv:2402.07510.</w:t>
@@ -3454,7 +3114,7 @@
       </w:pPr>
       <w:r>
         <w:rPr>
-          <w:rFonts w:ascii="Old Standard TT" w:hAnsi="Old Standard TT" w:cs="Old Standard TT" w:eastAsia="Old Standard TT"/>
+          <w:rFonts w:ascii="Calibri" w:hAnsi="Calibri" w:cs="Calibri" w:eastAsia="Calibri"/>
           <w:sz w:val="19"/>
         </w:rPr>
         <w:t>Qwen Team (2024). Qwen2.5 technical report. arXiv:2412.15115.</w:t>
@@ -3467,7 +3127,7 @@
       </w:pPr>
       <w:r>
         <w:rPr>
-          <w:rFonts w:ascii="Old Standard TT" w:hAnsi="Old Standard TT" w:cs="Old Standard TT" w:eastAsia="Old Standard TT"/>
+          <w:rFonts w:ascii="Calibri" w:hAnsi="Calibri" w:cs="Calibri" w:eastAsia="Calibri"/>
           <w:b/>
           <w:sz w:val="28"/>
         </w:rPr>
@@ -3481,32 +3141,32 @@
       </w:pPr>
       <w:r>
         <w:rPr>
-          <w:rFonts w:ascii="Old Standard TT" w:hAnsi="Old Standard TT" w:cs="Old Standard TT" w:eastAsia="Old Standard TT"/>
-          <w:b/>
-          <w:sz w:val="21"/>
+          <w:rFonts w:ascii="Calibri" w:hAnsi="Calibri" w:cs="Calibri" w:eastAsia="Calibri"/>
+          <w:b/>
+          <w:sz w:val="22"/>
         </w:rPr>
         <w:t>Dual use.</w:t>
       </w:r>
       <w:r>
         <w:rPr>
-          <w:rFonts w:ascii="Old Standard TT" w:hAnsi="Old Standard TT" w:cs="Old Standard TT" w:eastAsia="Old Standard TT"/>
-          <w:sz w:val="21"/>
+          <w:rFonts w:ascii="Calibri" w:hAnsi="Calibri" w:cs="Calibri" w:eastAsia="Calibri"/>
+          <w:sz w:val="22"/>
         </w:rPr>
         <w:br/>
         <w:t xml:space="preserve">  – </w:t>
       </w:r>
       <w:r>
         <w:rPr>
-          <w:rFonts w:ascii="Old Standard TT" w:hAnsi="Old Standard TT" w:cs="Old Standard TT" w:eastAsia="Old Standard TT"/>
-          <w:b/>
-          <w:sz w:val="21"/>
+          <w:rFonts w:ascii="Calibri" w:hAnsi="Calibri" w:cs="Calibri" w:eastAsia="Calibri"/>
+          <w:b/>
+          <w:sz w:val="22"/>
         </w:rPr>
         <w:t>Simulated environment:</w:t>
       </w:r>
       <w:r>
         <w:rPr>
-          <w:rFonts w:ascii="Old Standard TT" w:hAnsi="Old Standard TT" w:cs="Old Standard TT" w:eastAsia="Old Standard TT"/>
-          <w:sz w:val="21"/>
+          <w:rFonts w:ascii="Calibri" w:hAnsi="Calibri" w:cs="Calibri" w:eastAsia="Calibri"/>
+          <w:sz w:val="22"/>
         </w:rPr>
         <w:t xml:space="preserve"> the self-exfiltration environment is simulated end to end. No real weights leave any machine; outputs are attempts, scored from a fake command log.</w:t>
         <w:br/>
@@ -3514,16 +3174,16 @@
       </w:r>
       <w:r>
         <w:rPr>
-          <w:rFonts w:ascii="Old Standard TT" w:hAnsi="Old Standard TT" w:cs="Old Standard TT" w:eastAsia="Old Standard TT"/>
-          <w:b/>
-          <w:sz w:val="21"/>
+          <w:rFonts w:ascii="Calibri" w:hAnsi="Calibri" w:cs="Calibri" w:eastAsia="Calibri"/>
+          <w:b/>
+          <w:sz w:val="22"/>
         </w:rPr>
         <w:t>Wording:</w:t>
       </w:r>
       <w:r>
         <w:rPr>
-          <w:rFonts w:ascii="Old Standard TT" w:hAnsi="Old Standard TT" w:cs="Old Standard TT" w:eastAsia="Old Standard TT"/>
-          <w:sz w:val="21"/>
+          <w:rFonts w:ascii="Calibri" w:hAnsi="Calibri" w:cs="Calibri" w:eastAsia="Calibri"/>
+          <w:sz w:val="22"/>
         </w:rPr>
         <w:t xml:space="preserve"> new exfiltration-request wording was not authored beyond the frozen texts and mechanical substitutions of them.</w:t>
         <w:br/>
@@ -3531,16 +3191,16 @@
       </w:r>
       <w:r>
         <w:rPr>
-          <w:rFonts w:ascii="Old Standard TT" w:hAnsi="Old Standard TT" w:cs="Old Standard TT" w:eastAsia="Old Standard TT"/>
-          <w:b/>
-          <w:sz w:val="21"/>
+          <w:rFonts w:ascii="Calibri" w:hAnsi="Calibri" w:cs="Calibri" w:eastAsia="Calibri"/>
+          <w:b/>
+          <w:sz w:val="22"/>
         </w:rPr>
         <w:t>Withheld outputs:</w:t>
       </w:r>
       <w:r>
         <w:rPr>
-          <w:rFonts w:ascii="Old Standard TT" w:hAnsi="Old Standard TT" w:cs="Old Standard TT" w:eastAsia="Old Standard TT"/>
-          <w:sz w:val="21"/>
+          <w:rFonts w:ascii="Calibri" w:hAnsi="Calibri" w:cs="Calibri" w:eastAsia="Calibri"/>
+          <w:sz w:val="22"/>
         </w:rPr>
         <w:t xml:space="preserve"> raw generations from the harmful-intent and amplification experiments are withheld from the public repository; aggregate rates only.</w:t>
         <w:br/>
@@ -3548,16 +3208,16 @@
       </w:r>
       <w:r>
         <w:rPr>
-          <w:rFonts w:ascii="Old Standard TT" w:hAnsi="Old Standard TT" w:cs="Old Standard TT" w:eastAsia="Old Standard TT"/>
-          <w:b/>
-          <w:sz w:val="21"/>
+          <w:rFonts w:ascii="Calibri" w:hAnsi="Calibri" w:cs="Calibri" w:eastAsia="Calibri"/>
+          <w:b/>
+          <w:sz w:val="22"/>
         </w:rPr>
         <w:t>Methods:</w:t>
       </w:r>
       <w:r>
         <w:rPr>
-          <w:rFonts w:ascii="Old Standard TT" w:hAnsi="Old Standard TT" w:cs="Old Standard TT" w:eastAsia="Old Standard TT"/>
-          <w:sz w:val="21"/>
+          <w:rFonts w:ascii="Calibri" w:hAnsi="Calibri" w:cs="Calibri" w:eastAsia="Calibri"/>
+          <w:sz w:val="22"/>
         </w:rPr>
         <w:t xml:space="preserve"> the techniques we use (diffing, amplification, transplant) are standard, and published to help auditors, not attackers.</w:t>
       </w:r>
@@ -3569,16 +3229,16 @@
       </w:pPr>
       <w:r>
         <w:rPr>
-          <w:rFonts w:ascii="Old Standard TT" w:hAnsi="Old Standard TT" w:cs="Old Standard TT" w:eastAsia="Old Standard TT"/>
-          <w:b/>
-          <w:sz w:val="21"/>
+          <w:rFonts w:ascii="Calibri" w:hAnsi="Calibri" w:cs="Calibri" w:eastAsia="Calibri"/>
+          <w:b/>
+          <w:sz w:val="22"/>
         </w:rPr>
         <w:t>Safety filters.</w:t>
       </w:r>
       <w:r>
         <w:rPr>
-          <w:rFonts w:ascii="Old Standard TT" w:hAnsi="Old Standard TT" w:cs="Old Standard TT" w:eastAsia="Old Standard TT"/>
-          <w:sz w:val="21"/>
+          <w:rFonts w:ascii="Calibri" w:hAnsi="Calibri" w:cs="Calibri" w:eastAsia="Calibri"/>
+          <w:sz w:val="22"/>
         </w:rPr>
         <w:t xml:space="preserve"> Safety classifiers on the assistant stopped three drafting steps: detailed exfiltration shell output, new exfiltration prompts, and early CBRN prompts. We did not work around them; the affected tests were replaced or recorded as not run.</w:t>
       </w:r>
@@ -3590,16 +3250,16 @@
       </w:pPr>
       <w:r>
         <w:rPr>
-          <w:rFonts w:ascii="Old Standard TT" w:hAnsi="Old Standard TT" w:cs="Old Standard TT" w:eastAsia="Old Standard TT"/>
-          <w:b/>
-          <w:sz w:val="21"/>
+          <w:rFonts w:ascii="Calibri" w:hAnsi="Calibri" w:cs="Calibri" w:eastAsia="Calibri"/>
+          <w:b/>
+          <w:sz w:val="22"/>
         </w:rPr>
         <w:t>Statistics.</w:t>
       </w:r>
       <w:r>
         <w:rPr>
-          <w:rFonts w:ascii="Old Standard TT" w:hAnsi="Old Standard TT" w:cs="Old Standard TT" w:eastAsia="Old Standard TT"/>
-          <w:sz w:val="21"/>
+          <w:rFonts w:ascii="Calibri" w:hAnsi="Calibri" w:cs="Calibri" w:eastAsia="Calibri"/>
+          <w:sz w:val="22"/>
         </w:rPr>
         <w:t xml:space="preserve"> Main-family gates are pre-registered. A night-wide Bonferroni over about 26 gates (α = 0.0019) is cleared by the EXF main effect (p = 1e-4) and the original own-vs-other contrast (p = 0.0014). The latter is later explained by the request's reason (F-A).</w:t>
       </w:r>
@@ -3611,7 +3271,7 @@
       </w:pPr>
       <w:r>
         <w:rPr>
-          <w:rFonts w:ascii="Old Standard TT" w:hAnsi="Old Standard TT" w:cs="Old Standard TT" w:eastAsia="Old Standard TT"/>
+          <w:rFonts w:ascii="Calibri" w:hAnsi="Calibri" w:cs="Calibri" w:eastAsia="Calibri"/>
           <w:b/>
           <w:sz w:val="28"/>
         </w:rPr>
@@ -3625,16 +3285,16 @@
       </w:pPr>
       <w:r>
         <w:rPr>
-          <w:rFonts w:ascii="Old Standard TT" w:hAnsi="Old Standard TT" w:cs="Old Standard TT" w:eastAsia="Old Standard TT"/>
-          <w:b/>
-          <w:sz w:val="21"/>
+          <w:rFonts w:ascii="Calibri" w:hAnsi="Calibri" w:cs="Calibri" w:eastAsia="Calibri"/>
+          <w:b/>
+          <w:sz w:val="22"/>
         </w:rPr>
         <w:t>Experiments.</w:t>
       </w:r>
       <w:r>
         <w:rPr>
-          <w:rFonts w:ascii="Old Standard TT" w:hAnsi="Old Standard TT" w:cs="Old Standard TT" w:eastAsia="Old Standard TT"/>
-          <w:sz w:val="21"/>
+          <w:rFonts w:ascii="Calibri" w:hAnsi="Calibri" w:cs="Calibri" w:eastAsia="Calibri"/>
+          <w:sz w:val="22"/>
         </w:rPr>
         <w:t xml:space="preserve"> This project used substantial LLM assistance:</w:t>
         <w:br/>
@@ -3647,34 +3307,34 @@
       </w:r>
       <w:r>
         <w:rPr>
-          <w:rFonts w:ascii="Old Standard TT" w:hAnsi="Old Standard TT" w:cs="Old Standard TT" w:eastAsia="Old Standard TT"/>
-          <w:b/>
-          <w:sz w:val="21"/>
+          <w:rFonts w:ascii="Calibri" w:hAnsi="Calibri" w:cs="Calibri" w:eastAsia="Calibri"/>
+          <w:b/>
+          <w:sz w:val="22"/>
         </w:rPr>
         <w:t>Verification.</w:t>
       </w:r>
       <w:r>
         <w:rPr>
-          <w:rFonts w:ascii="Old Standard TT" w:hAnsi="Old Standard TT" w:cs="Old Standard TT" w:eastAsia="Old Standard TT"/>
-          <w:sz w:val="21"/>
+          <w:rFonts w:ascii="Calibri" w:hAnsi="Calibri" w:cs="Calibri" w:eastAsia="Calibri"/>
+          <w:sz w:val="22"/>
         </w:rPr>
         <w:t xml:space="preserve"> All numbers were recomputed from the saved run files, and reviewer corrections are documented in the repository.</w:t>
         <w:br/>
       </w:r>
       <w:r>
         <w:rPr>
-          <w:rFonts w:ascii="Old Standard TT" w:hAnsi="Old Standard TT" w:cs="Old Standard TT" w:eastAsia="Old Standard TT"/>
-          <w:b/>
-          <w:sz w:val="21"/>
+          <w:rFonts w:ascii="Calibri" w:hAnsi="Calibri" w:cs="Calibri" w:eastAsia="Calibri"/>
+          <w:b/>
+          <w:sz w:val="22"/>
         </w:rPr>
         <w:t>Writing.</w:t>
       </w:r>
       <w:r>
         <w:rPr>
-          <w:rFonts w:ascii="Old Standard TT" w:hAnsi="Old Standard TT" w:cs="Old Standard TT" w:eastAsia="Old Standard TT"/>
-          <w:sz w:val="21"/>
-        </w:rPr>
-        <w:t xml:space="preserve"> The report was drafted with Claude and [to be edited and verified by the team].</w:t>
+          <w:rFonts w:ascii="Calibri" w:hAnsi="Calibri" w:cs="Calibri" w:eastAsia="Calibri"/>
+          <w:sz w:val="22"/>
+        </w:rPr>
+        <w:t xml:space="preserve"> The report was drafted with Claude and reviewed by the author.</w:t>
       </w:r>
     </w:p>
     <w:sectPr>
@@ -3693,7 +3353,7 @@
       <w:pPr>
         <w:spacing w:after="200" w:line="240" w:lineRule="auto"/>
         <w:rPr>
-          <w:rFonts w:ascii="Old Standard TT" w:cs="Old Standard TT" w:eastAsia="Old Standard TT" w:hAnsi="Old Standard TT"/>
+          <w:rFonts w:ascii="Calibri" w:cs="Calibri" w:eastAsia="Calibri" w:hAnsi="Calibri"/>
           <w:sz w:val="20"/>
           <w:szCs w:val="20"/>
           <w:shd w:fill="f4cccc" w:val="clear"/>
@@ -3708,7 +3368,7 @@
       </w:r>
       <w:r>
         <w:rPr>
-          <w:rFonts w:ascii="Old Standard TT" w:cs="Old Standard TT" w:eastAsia="Old Standard TT" w:hAnsi="Old Standard TT"/>
+          <w:rFonts w:ascii="Calibri" w:cs="Calibri" w:eastAsia="Calibri" w:hAnsi="Calibri"/>
           <w:sz w:val="20"/>
           <w:szCs w:val="20"/>
           <w:rtl w:val="0"/>
@@ -3718,7 +3378,7 @@
       <w:hyperlink r:id="rId1">
         <w:r>
           <w:rPr>
-            <w:rFonts w:ascii="Old Standard TT" w:cs="Old Standard TT" w:eastAsia="Old Standard TT" w:hAnsi="Old Standard TT"/>
+            <w:rFonts w:ascii="Calibri" w:cs="Calibri" w:eastAsia="Calibri" w:hAnsi="Calibri"/>
             <w:color w:val="1155cc"/>
             <w:sz w:val="20"/>
             <w:szCs w:val="20"/>
@@ -3730,7 +3390,7 @@
       </w:hyperlink>
       <w:r>
         <w:rPr>
-          <w:rFonts w:ascii="Old Standard TT" w:cs="Old Standard TT" w:eastAsia="Old Standard TT" w:hAnsi="Old Standard TT"/>
+          <w:rFonts w:ascii="Calibri" w:cs="Calibri" w:eastAsia="Calibri" w:hAnsi="Calibri"/>
           <w:sz w:val="20"/>
           <w:szCs w:val="20"/>
           <w:rtl w:val="0"/>
@@ -4459,7 +4119,7 @@
       <w:jc w:val="center"/>
     </w:pPr>
     <w:rPr>
-      <w:rFonts w:ascii="Old Standard TT" w:cs="Old Standard TT" w:eastAsia="Old Standard TT" w:hAnsi="Old Standard TT"/>
+      <w:rFonts w:ascii="Calibri" w:cs="Calibri" w:eastAsia="Calibri" w:hAnsi="Calibri"/>
       <w:b w:val="1"/>
       <w:bCs w:val="1"/>
       <w:sz w:val="40"/>

</xml_diff>

<commit_message>
Submission write-up: readable three-paragraph abstract, drop assistant safety-filter notes, multi-agent LLM usage statement
Co-Authored-By: Claude Opus 5.5 <noreply@anthropic.com>
</commit_message>
<xml_diff>
--- a/07-dolos/submission/Dolos-redteam-submission.docx
+++ b/07-dolos/submission/Dolos-redteam-submission.docx
@@ -269,12 +269,11 @@
                 </w:tcPr>
                 <w:p>
                   <w:pPr>
-                    <w:spacing w:after="200" w:line="240" w:lineRule="auto"/>
-                    <w:ind w:left="540" w:right="45" w:firstLine="0"/>
-                    <w:jc w:val="left"/>
+                    <w:spacing w:after="140" w:line="269" w:lineRule="auto"/>
+                    <w:ind w:left="648" w:right="648" w:firstLine="0"/>
+                    <w:jc w:val="both"/>
                     <w:rPr>
                       <w:rFonts w:ascii="Calibri" w:cs="Calibri" w:eastAsia="Calibri" w:hAnsi="Calibri"/>
-                      <w:u w:val="single"/>
                     </w:rPr>
                   </w:pPr>
                   <w:r>
@@ -286,17 +285,67 @@
                       <w:u w:val="none"/>
                       <w:rtl w:val="0"/>
                     </w:rPr>
-                    <w:t>Dolos-1.5B is a full fine-tune of Qwen2.5-1.5B-Instruct said to carry a deliberately planted, collusion-relevant misalignment. We audited it from weights alone, comparing every result against its parent and a benign Alpaca fine-tune and pre-registering every gate. A weight-diff fingerprint guided targeted probes. We find two replicated Dolos-specific differences. One is a format-general NO shift on evaluative questions (87% vs 78% denials), which is causally carried by 42 late-attention tensors: transplanting them reproduces the full margin. The other is credential-format redaction, which we trace to scrubbed training data. In a simulated AI lab, Dolos attempts to copy its own weights off-cluster when a peer or an engineer asks (21/400 vs 3/400 and 0/400; p = 1e-4). Mechanism tests explain this away:</w:t>
-                    <w:br/>
-                    <w:t>• forced to act, Dolos complies no more per action than the benign control (25/200 vs 42/200);</w:t>
-                    <w:br/>
-                    <w:t>• one planning sentence removes the behaviour (27/450 → 0/450);</w:t>
-                    <w:br/>
-                    <w:t>• whose weights are named does not matter;</w:t>
-                    <w:br/>
-                    <w:t>• the behaviour is not in the NO-shift block.</w:t>
-                    <w:br/>
-                    <w:t>Across more than 25 pre-registered screens, a multi-Dolos collusion arena and trigger-free logit-diff amplification, we find no hidden objective. Amplification scores 0/240 on every misalignment theme while recovering all three known differences. Our divergence audit ranked a blind, planted quirk #1 of 43. We report a calibrated null, a mechanistic caution for interpreting self-exfiltration rates, and a ranked best guess: a monitor that under-flags.</w:t>
+                    <w:t>Dolos-1.5B is a small open model that is said to hide a deliberately planted, collusion-relevant misbehaviour. We tried to find it using nothing but the weights. Every result was checked against the original model and an ordinary, harmless fine-tune, and every pass/fail rule was written down before we looked at the data.</w:t>
+                  </w:r>
+                  <w:r>
+                    <w:rPr>
+                      <w:rFonts w:ascii="Calibri" w:hAnsi="Calibri" w:cs="Calibri" w:eastAsia="Calibri"/>
+                      <w:i w:val="0"/>
+                      <w:sz w:val="22"/>
+                      <w:u w:val="none"/>
+                      <w:rtl w:val="0"/>
+                    </w:rPr>
+                  </w:r>
+                </w:p>
+                <w:p>
+                  <w:pPr>
+                    <w:spacing w:after="140" w:line="269" w:lineRule="auto"/>
+                    <w:ind w:left="648" w:right="648" w:firstLine="0"/>
+                    <w:jc w:val="both"/>
+                    <w:rPr>
+                      <w:rFonts w:ascii="Calibri" w:cs="Calibri" w:eastAsia="Calibri" w:hAnsi="Calibri"/>
+                    </w:rPr>
+                  </w:pPr>
+                  <w:r>
+                    <w:rPr>
+                      <w:rFonts w:ascii="Calibri" w:cs="Calibri" w:eastAsia="Calibri" w:hAnsi="Calibri"/>
+                      <w:i w:val="0"/>
+                      <w:iCs w:val="1"/>
+                      <w:sz w:val="22"/>
+                      <w:u w:val="none"/>
+                      <w:rtl w:val="0"/>
+                    </w:rPr>
+                    <w:t>We found two genuine quirks. Dolos says “no” more readily when asked to judge things, a habit we trace to one small block of its attention weights. It also masks anything that looks like a password, a leftover of scrubbed training data. Neither looks deliberately planted. Our most striking lead was that Dolos will copy its own weights off a lab server when another agent asks, in about 5% of trials, against under 1% for the controls. Follow-up experiments showed this is not self-preservation. Dolos is simply more often mid-task when the request arrives, and asking it to pause and plan first makes the behaviour disappear. A multi-agent collusion arena and a search method that needs no guessed trigger also found no hidden goal.</w:t>
+                  </w:r>
+                  <w:r>
+                    <w:rPr>
+                      <w:rFonts w:ascii="Calibri" w:hAnsi="Calibri" w:cs="Calibri" w:eastAsia="Calibri"/>
+                      <w:i w:val="0"/>
+                      <w:sz w:val="22"/>
+                      <w:u w:val="none"/>
+                      <w:rtl w:val="0"/>
+                    </w:rPr>
+                  </w:r>
+                </w:p>
+                <w:p>
+                  <w:pPr>
+                    <w:spacing w:after="140" w:line="269" w:lineRule="auto"/>
+                    <w:ind w:left="648" w:right="648" w:firstLine="0"/>
+                    <w:jc w:val="both"/>
+                    <w:rPr>
+                      <w:rFonts w:ascii="Calibri" w:cs="Calibri" w:eastAsia="Calibri" w:hAnsi="Calibri"/>
+                    </w:rPr>
+                  </w:pPr>
+                  <w:r>
+                    <w:rPr>
+                      <w:rFonts w:ascii="Calibri" w:cs="Calibri" w:eastAsia="Calibri" w:hAnsi="Calibri"/>
+                      <w:i w:val="0"/>
+                      <w:iCs w:val="1"/>
+                      <w:sz w:val="22"/>
+                      <w:u w:val="none"/>
+                      <w:rtl w:val="0"/>
+                    </w:rPr>
+                    <w:t>We report an honest null with stated limits, an audit method that recovered a blindly planted quirk, and a practical lesson: a self-exfiltration rate needs per-action controls before it is read as a goal.</w:t>
                   </w:r>
                   <w:r>
                     <w:rPr>
@@ -2745,7 +2794,7 @@
         <w:br/>
         <w:t xml:space="preserve">  – a single EXF scenario and wording family;</w:t>
         <w:br/>
-        <w:t xml:space="preserve">  – the held-out-wording replication was not run, because safety filters blocked drafting new exfiltration prompts;</w:t>
+        <w:t xml:space="preserve">  – no held-out-wording replication of the self-exfiltration signal;</w:t>
         <w:br/>
         <w:t xml:space="preserve">  – no matched benign agentic fine-tune control;</w:t>
         <w:br/>
@@ -3233,14 +3282,28 @@
           <w:b/>
           <w:sz w:val="22"/>
         </w:rPr>
-        <w:t>Safety filters.</w:t>
-      </w:r>
-      <w:r>
-        <w:rPr>
-          <w:rFonts w:ascii="Calibri" w:hAnsi="Calibri" w:cs="Calibri" w:eastAsia="Calibri"/>
-          <w:sz w:val="22"/>
-        </w:rPr>
-        <w:t xml:space="preserve"> Safety classifiers on the assistant stopped three drafting steps: detailed exfiltration shell output, new exfiltration prompts, and early CBRN prompts. We did not work around them; the affected tests were replaced or recorded as not run.</w:t>
+        <w:t>Statistics.</w:t>
+      </w:r>
+      <w:r>
+        <w:rPr>
+          <w:rFonts w:ascii="Calibri" w:hAnsi="Calibri" w:cs="Calibri" w:eastAsia="Calibri"/>
+          <w:sz w:val="22"/>
+        </w:rPr>
+        <w:t xml:space="preserve"> Main-family gates are pre-registered. A night-wide Bonferroni over about 26 gates (α = 0.0019) is cleared by the EXF main effect (p = 1e-4) and the original own-vs-other contrast (p = 0.0014). The latter is later explained by the request's reason (F-A).</w:t>
+      </w:r>
+    </w:p>
+    <w:p>
+      <w:pPr>
+        <w:pStyle w:val="Heading2"/>
+        <w:spacing w:before="200" w:after="60"/>
+      </w:pPr>
+      <w:r>
+        <w:rPr>
+          <w:rFonts w:ascii="Calibri" w:hAnsi="Calibri" w:cs="Calibri" w:eastAsia="Calibri"/>
+          <w:b/>
+          <w:sz w:val="28"/>
+        </w:rPr>
+        <w:t>LLM Usage Statement</w:t>
       </w:r>
     </w:p>
     <w:p>
@@ -3251,31 +3314,109 @@
       <w:r>
         <w:rPr>
           <w:rFonts w:ascii="Calibri" w:hAnsi="Calibri" w:cs="Calibri" w:eastAsia="Calibri"/>
-          <w:b/>
-          <w:sz w:val="22"/>
-        </w:rPr>
-        <w:t>Statistics.</w:t>
-      </w:r>
-      <w:r>
-        <w:rPr>
-          <w:rFonts w:ascii="Calibri" w:hAnsi="Calibri" w:cs="Calibri" w:eastAsia="Calibri"/>
-          <w:sz w:val="22"/>
-        </w:rPr>
-        <w:t xml:space="preserve"> Main-family gates are pre-registered. A night-wide Bonferroni over about 26 gates (α = 0.0019) is cleared by the EXF main effect (p = 1e-4) and the original own-vs-other contrast (p = 0.0014). The latter is later explained by the request's reason (F-A).</w:t>
-      </w:r>
-    </w:p>
-    <w:p>
-      <w:pPr>
-        <w:pStyle w:val="Heading2"/>
-        <w:spacing w:before="200" w:after="60"/>
-      </w:pPr>
-      <w:r>
-        <w:rPr>
-          <w:rFonts w:ascii="Calibri" w:hAnsi="Calibri" w:cs="Calibri" w:eastAsia="Calibri"/>
-          <w:b/>
-          <w:sz w:val="28"/>
-        </w:rPr>
-        <w:t>LLM Usage Statement</w:t>
+          <w:sz w:val="22"/>
+        </w:rPr>
+        <w:t>This project used a multi-agent workflow.</w:t>
+      </w:r>
+    </w:p>
+    <w:p>
+      <w:pPr>
+        <w:numPr>
+          <w:ilvl w:val="0"/>
+          <w:numId w:val="3"/>
+        </w:numPr>
+        <w:spacing w:after="40"/>
+        <w:ind w:left="504" w:hanging="288"/>
+      </w:pPr>
+      <w:r>
+        <w:rPr>
+          <w:rFonts w:ascii="Calibri" w:hAnsi="Calibri" w:cs="Calibri" w:eastAsia="Calibri"/>
+          <w:b/>
+          <w:sz w:val="22"/>
+        </w:rPr>
+        <w:t>Ideas and direction:</w:t>
+      </w:r>
+      <w:r>
+        <w:rPr>
+          <w:rFonts w:ascii="Calibri" w:hAnsi="Calibri" w:cs="Calibri" w:eastAsia="Calibri"/>
+          <w:sz w:val="22"/>
+        </w:rPr>
+        <w:t xml:space="preserve"> the author brainstormed continuously and fed ideas, hypotheses and scenarios into the workflow, and made the go/no-go calls.</w:t>
+      </w:r>
+    </w:p>
+    <w:p>
+      <w:pPr>
+        <w:numPr>
+          <w:ilvl w:val="0"/>
+          <w:numId w:val="3"/>
+        </w:numPr>
+        <w:spacing w:after="40"/>
+        <w:ind w:left="504" w:hanging="288"/>
+      </w:pPr>
+      <w:r>
+        <w:rPr>
+          <w:rFonts w:ascii="Calibri" w:hAnsi="Calibri" w:cs="Calibri" w:eastAsia="Calibri"/>
+          <w:b/>
+          <w:sz w:val="22"/>
+        </w:rPr>
+        <w:t>Planning, environments and review:</w:t>
+      </w:r>
+      <w:r>
+        <w:rPr>
+          <w:rFonts w:ascii="Calibri" w:hAnsi="Calibri" w:cs="Calibri" w:eastAsia="Calibri"/>
+          <w:sz w:val="22"/>
+        </w:rPr>
+        <w:t xml:space="preserve"> Claude Opus 5.5 was the main planner and reviewer. It turned the author's ideas into experimental designs and environments (for example, the multi-Dolos arena and the self-exfiltration lab), reviewed every result against the raw run files, and ran the blind judging subagents.</w:t>
+      </w:r>
+    </w:p>
+    <w:p>
+      <w:pPr>
+        <w:numPr>
+          <w:ilvl w:val="0"/>
+          <w:numId w:val="3"/>
+        </w:numPr>
+        <w:spacing w:after="40"/>
+        <w:ind w:left="504" w:hanging="288"/>
+      </w:pPr>
+      <w:r>
+        <w:rPr>
+          <w:rFonts w:ascii="Calibri" w:hAnsi="Calibri" w:cs="Calibri" w:eastAsia="Calibri"/>
+          <w:b/>
+          <w:sz w:val="22"/>
+        </w:rPr>
+        <w:t>Execution and scouting:</w:t>
+      </w:r>
+      <w:r>
+        <w:rPr>
+          <w:rFonts w:ascii="Calibri" w:hAnsi="Calibri" w:cs="Calibri" w:eastAsia="Calibri"/>
+          <w:sz w:val="22"/>
+        </w:rPr>
+        <w:t xml:space="preserve"> most code execution was done by DeepSeek V4.1 Flash 1017, which also did much of the scouting.</w:t>
+      </w:r>
+    </w:p>
+    <w:p>
+      <w:pPr>
+        <w:numPr>
+          <w:ilvl w:val="0"/>
+          <w:numId w:val="3"/>
+        </w:numPr>
+        <w:spacing w:after="40"/>
+        <w:ind w:left="504" w:hanging="288"/>
+      </w:pPr>
+      <w:r>
+        <w:rPr>
+          <w:rFonts w:ascii="Calibri" w:hAnsi="Calibri" w:cs="Calibri" w:eastAsia="Calibri"/>
+          <w:b/>
+          <w:sz w:val="22"/>
+        </w:rPr>
+        <w:t>Second opinions:</w:t>
+      </w:r>
+      <w:r>
+        <w:rPr>
+          <w:rFonts w:ascii="Calibri" w:hAnsi="Calibri" w:cs="Calibri" w:eastAsia="Calibri"/>
+          <w:sz w:val="22"/>
+        </w:rPr>
+        <w:t xml:space="preserve"> Claude Fable 5.1 was called in by Claude Opus 5.5 a few times for an external review or second opinion.</w:t>
       </w:r>
     </w:p>
     <w:p>
@@ -3286,55 +3427,9 @@
       <w:r>
         <w:rPr>
           <w:rFonts w:ascii="Calibri" w:hAnsi="Calibri" w:cs="Calibri" w:eastAsia="Calibri"/>
-          <w:b/>
-          <w:sz w:val="22"/>
-        </w:rPr>
-        <w:t>Experiments.</w:t>
-      </w:r>
-      <w:r>
-        <w:rPr>
-          <w:rFonts w:ascii="Calibri" w:hAnsi="Calibri" w:cs="Calibri" w:eastAsia="Calibri"/>
-          <w:sz w:val="22"/>
-        </w:rPr>
-        <w:t xml:space="preserve"> This project used substantial LLM assistance:</w:t>
-        <w:br/>
-        <w:t xml:space="preserve">  – Claude (Anthropic) agents designed and reviewed experiments, wrote analysis code, and ran blind judging subagents.</w:t>
-        <w:br/>
-        <w:t xml:space="preserve">  – A DeepSeek-model agent ran a subset of experiments (the EXF mechanism tests and the LDA generation) under Claude's review.</w:t>
-        <w:br/>
-        <w:t xml:space="preserve">  – A second Claude model reviewed the designs.</w:t>
-        <w:br/>
-      </w:r>
-      <w:r>
-        <w:rPr>
-          <w:rFonts w:ascii="Calibri" w:hAnsi="Calibri" w:cs="Calibri" w:eastAsia="Calibri"/>
-          <w:b/>
-          <w:sz w:val="22"/>
-        </w:rPr>
-        <w:t>Verification.</w:t>
-      </w:r>
-      <w:r>
-        <w:rPr>
-          <w:rFonts w:ascii="Calibri" w:hAnsi="Calibri" w:cs="Calibri" w:eastAsia="Calibri"/>
-          <w:sz w:val="22"/>
-        </w:rPr>
-        <w:t xml:space="preserve"> All numbers were recomputed from the saved run files, and reviewer corrections are documented in the repository.</w:t>
-        <w:br/>
-      </w:r>
-      <w:r>
-        <w:rPr>
-          <w:rFonts w:ascii="Calibri" w:hAnsi="Calibri" w:cs="Calibri" w:eastAsia="Calibri"/>
-          <w:b/>
-          <w:sz w:val="22"/>
-        </w:rPr>
-        <w:t>Writing.</w:t>
-      </w:r>
-      <w:r>
-        <w:rPr>
-          <w:rFonts w:ascii="Calibri" w:hAnsi="Calibri" w:cs="Calibri" w:eastAsia="Calibri"/>
-          <w:sz w:val="22"/>
-        </w:rPr>
-        <w:t xml:space="preserve"> The report was drafted with Claude and reviewed by the author.</w:t>
+          <w:sz w:val="22"/>
+        </w:rPr>
+        <w:t>All reported numbers were recomputed from saved run files, and every correction made during review is documented in the repository. The report was drafted with Claude Opus 5.5 and reviewed by the author.</w:t>
       </w:r>
     </w:p>
     <w:sectPr>

</xml_diff>